<commit_message>
The start of lab 9
</commit_message>
<xml_diff>
--- a/Lab 8/Impulse and Momentum (DROPBOX).docx
+++ b/Lab 8/Impulse and Momentum (DROPBOX).docx
@@ -151,6 +151,18 @@
       <w:r>
         <w:br w:type="page"/>
       </w:r>
+    </w:p>
+    <w:p>
+      <w:pPr>
+        <w:pStyle w:val="Heading1"/>
+        <w:sectPr>
+          <w:pgSz w:w="12240" w:h="15840" w:code="1"/>
+          <w:pgMar w:top="720" w:right="720" w:bottom="720" w:left="720" w:header="720" w:footer="720" w:gutter="0"/>
+          <w:cols w:space="720"/>
+          <w:vAlign w:val="center"/>
+          <w:docGrid w:linePitch="360"/>
+        </w:sectPr>
+      </w:pPr>
     </w:p>
     <w:p>
       <w:pPr>
@@ -1415,7 +1427,7 @@
         <w:pStyle w:val="NormalWeb"/>
         <w:numPr>
           <w:ilvl w:val="0"/>
-          <w:numId w:val="1"/>
+          <w:numId w:val="4"/>
         </w:numPr>
         <w:spacing w:before="200" w:beforeAutospacing="0" w:after="0" w:afterAutospacing="0"/>
         <w:rPr>
@@ -1495,9 +1507,264 @@
     <w:p>
       <w:pPr>
         <w:pStyle w:val="NormalWeb"/>
+        <w:spacing w:before="200" w:beforeAutospacing="0" w:after="0" w:afterAutospacing="0"/>
+        <w:ind w:left="720"/>
+        <w:rPr>
+          <w:rFonts w:eastAsiaTheme="minorEastAsia"/>
+          <w:color w:val="404040" w:themeColor="text1" w:themeTint="BF"/>
+          <w:kern w:val="24"/>
+        </w:rPr>
+      </w:pPr>
+      <w:r>
+        <w:rPr>
+          <w:rFonts w:eastAsiaTheme="minorEastAsia"/>
+          <w:color w:val="404040" w:themeColor="text1" w:themeTint="BF"/>
+          <w:kern w:val="24"/>
+        </w:rPr>
+        <w:t>Elastic 1:</w:t>
+      </w:r>
+    </w:p>
+    <w:p>
+      <w:pPr>
+        <w:pStyle w:val="NormalWeb"/>
+        <w:spacing w:before="200" w:beforeAutospacing="0" w:after="0" w:afterAutospacing="0"/>
+        <w:rPr>
+          <w:rFonts w:eastAsiaTheme="minorEastAsia"/>
+          <w:color w:val="404040" w:themeColor="text1" w:themeTint="BF"/>
+          <w:kern w:val="24"/>
+        </w:rPr>
+      </w:pPr>
+      <w:r>
+        <w:rPr>
+          <w:rFonts w:eastAsiaTheme="minorEastAsia"/>
+          <w:color w:val="404040" w:themeColor="text1" w:themeTint="BF"/>
+          <w:kern w:val="24"/>
+        </w:rPr>
+        <w:tab/>
+        <w:t xml:space="preserve">1. </w:t>
+      </w:r>
+      <m:oMath>
+        <m:r>
+          <w:rPr>
+            <w:rFonts w:ascii="Cambria Math" w:eastAsiaTheme="minorEastAsia" w:hAnsi="Cambria Math"/>
+            <w:color w:val="404040" w:themeColor="text1" w:themeTint="BF"/>
+            <w:kern w:val="24"/>
+          </w:rPr>
+          <m:t>1</m:t>
+        </m:r>
+        <m:r>
+          <w:rPr>
+            <w:rFonts w:ascii="Cambria Math" w:eastAsiaTheme="minorEastAsia" w:hAnsi="Cambria Math"/>
+            <w:color w:val="404040" w:themeColor="text1" w:themeTint="BF"/>
+            <w:kern w:val="24"/>
+          </w:rPr>
+          <m:t>.354×0.467=</m:t>
+        </m:r>
+        <m:r>
+          <w:rPr>
+            <w:rFonts w:ascii="Cambria Math" w:eastAsiaTheme="minorEastAsia" w:hAnsi="Cambria Math"/>
+            <w:color w:val="404040" w:themeColor="text1" w:themeTint="BF"/>
+            <w:kern w:val="24"/>
+          </w:rPr>
+          <m:t>(J)</m:t>
+        </m:r>
+      </m:oMath>
+    </w:p>
+    <w:p>
+      <w:pPr>
+        <w:pStyle w:val="NormalWeb"/>
+        <w:spacing w:before="200" w:beforeAutospacing="0" w:after="0" w:afterAutospacing="0"/>
+        <w:rPr>
+          <w:rFonts w:eastAsiaTheme="minorEastAsia"/>
+          <w:color w:val="404040" w:themeColor="text1" w:themeTint="BF"/>
+          <w:kern w:val="24"/>
+        </w:rPr>
+      </w:pPr>
+      <w:r>
+        <w:rPr>
+          <w:rFonts w:eastAsiaTheme="minorEastAsia"/>
+          <w:color w:val="404040" w:themeColor="text1" w:themeTint="BF"/>
+          <w:kern w:val="24"/>
+        </w:rPr>
+        <w:tab/>
+        <w:t xml:space="preserve">2. </w:t>
+      </w:r>
+      <m:oMath>
+        <m:r>
+          <w:rPr>
+            <w:rFonts w:ascii="Cambria Math" w:eastAsiaTheme="minorEastAsia" w:hAnsi="Cambria Math"/>
+            <w:color w:val="404040" w:themeColor="text1" w:themeTint="BF"/>
+            <w:kern w:val="24"/>
+          </w:rPr>
+          <m:t>1.532</m:t>
+        </m:r>
+        <m:r>
+          <w:rPr>
+            <w:rFonts w:ascii="Cambria Math" w:eastAsiaTheme="minorEastAsia" w:hAnsi="Cambria Math"/>
+            <w:color w:val="404040" w:themeColor="text1" w:themeTint="BF"/>
+            <w:kern w:val="24"/>
+          </w:rPr>
+          <m:t>×</m:t>
+        </m:r>
+        <m:r>
+          <w:rPr>
+            <w:rFonts w:ascii="Cambria Math" w:eastAsiaTheme="minorEastAsia" w:hAnsi="Cambria Math"/>
+            <w:color w:val="404040" w:themeColor="text1" w:themeTint="BF"/>
+            <w:kern w:val="24"/>
+          </w:rPr>
+          <m:t>0.418</m:t>
+        </m:r>
+        <m:r>
+          <w:rPr>
+            <w:rFonts w:ascii="Cambria Math" w:eastAsiaTheme="minorEastAsia" w:hAnsi="Cambria Math"/>
+            <w:color w:val="404040" w:themeColor="text1" w:themeTint="BF"/>
+            <w:kern w:val="24"/>
+          </w:rPr>
+          <m:t>=</m:t>
+        </m:r>
+        <m:r>
+          <w:rPr>
+            <w:rFonts w:ascii="Cambria Math" w:eastAsiaTheme="minorEastAsia" w:hAnsi="Cambria Math"/>
+            <w:color w:val="404040" w:themeColor="text1" w:themeTint="BF"/>
+            <w:kern w:val="24"/>
+          </w:rPr>
+          <m:t>(J)</m:t>
+        </m:r>
+      </m:oMath>
+    </w:p>
+    <w:p>
+      <w:pPr>
+        <w:pStyle w:val="NormalWeb"/>
+        <w:spacing w:before="200" w:beforeAutospacing="0" w:after="0" w:afterAutospacing="0"/>
+        <w:rPr>
+          <w:rFonts w:eastAsiaTheme="minorEastAsia"/>
+          <w:color w:val="404040" w:themeColor="text1" w:themeTint="BF"/>
+          <w:kern w:val="24"/>
+        </w:rPr>
+      </w:pPr>
+      <w:r>
+        <w:rPr>
+          <w:rFonts w:eastAsiaTheme="minorEastAsia"/>
+          <w:color w:val="404040" w:themeColor="text1" w:themeTint="BF"/>
+          <w:kern w:val="24"/>
+        </w:rPr>
+        <w:tab/>
+        <w:t>Elastic 2:</w:t>
+      </w:r>
+    </w:p>
+    <w:p>
+      <w:pPr>
+        <w:pStyle w:val="NormalWeb"/>
+        <w:spacing w:before="200" w:beforeAutospacing="0" w:after="0" w:afterAutospacing="0"/>
+        <w:rPr>
+          <w:rFonts w:eastAsiaTheme="minorEastAsia"/>
+          <w:color w:val="404040" w:themeColor="text1" w:themeTint="BF"/>
+          <w:kern w:val="24"/>
+        </w:rPr>
+      </w:pPr>
+      <w:r>
+        <w:rPr>
+          <w:rFonts w:eastAsiaTheme="minorEastAsia"/>
+          <w:color w:val="404040" w:themeColor="text1" w:themeTint="BF"/>
+          <w:kern w:val="24"/>
+        </w:rPr>
+        <w:tab/>
+        <w:t xml:space="preserve">1. </w:t>
+      </w:r>
+      <m:oMath>
+        <m:r>
+          <w:rPr>
+            <w:rFonts w:ascii="Cambria Math" w:eastAsiaTheme="minorEastAsia" w:hAnsi="Cambria Math"/>
+            <w:color w:val="404040" w:themeColor="text1" w:themeTint="BF"/>
+            <w:kern w:val="24"/>
+          </w:rPr>
+          <m:t>1.753</m:t>
+        </m:r>
+        <m:r>
+          <w:rPr>
+            <w:rFonts w:ascii="Cambria Math" w:eastAsiaTheme="minorEastAsia" w:hAnsi="Cambria Math"/>
+            <w:color w:val="404040" w:themeColor="text1" w:themeTint="BF"/>
+            <w:kern w:val="24"/>
+          </w:rPr>
+          <m:t>×</m:t>
+        </m:r>
+        <m:r>
+          <w:rPr>
+            <w:rFonts w:ascii="Cambria Math" w:eastAsiaTheme="minorEastAsia" w:hAnsi="Cambria Math"/>
+            <w:color w:val="404040" w:themeColor="text1" w:themeTint="BF"/>
+            <w:kern w:val="24"/>
+          </w:rPr>
+          <m:t>0.771</m:t>
+        </m:r>
+        <m:r>
+          <w:rPr>
+            <w:rFonts w:ascii="Cambria Math" w:eastAsiaTheme="minorEastAsia" w:hAnsi="Cambria Math"/>
+            <w:color w:val="404040" w:themeColor="text1" w:themeTint="BF"/>
+            <w:kern w:val="24"/>
+          </w:rPr>
+          <m:t>=</m:t>
+        </m:r>
+        <m:r>
+          <w:rPr>
+            <w:rFonts w:ascii="Cambria Math" w:eastAsiaTheme="minorEastAsia" w:hAnsi="Cambria Math"/>
+            <w:color w:val="404040" w:themeColor="text1" w:themeTint="BF"/>
+            <w:kern w:val="24"/>
+          </w:rPr>
+          <m:t>(J)</m:t>
+        </m:r>
+      </m:oMath>
+    </w:p>
+    <w:p>
+      <w:pPr>
+        <w:pStyle w:val="NormalWeb"/>
+        <w:spacing w:before="200" w:beforeAutospacing="0" w:after="0" w:afterAutospacing="0"/>
+        <w:ind w:firstLine="720"/>
+        <w:rPr>
+          <w:sz w:val="18"/>
+          <w:szCs w:val="18"/>
+        </w:rPr>
+      </w:pPr>
+      <w:r>
+        <w:rPr>
+          <w:rFonts w:eastAsiaTheme="minorEastAsia"/>
+          <w:color w:val="404040" w:themeColor="text1" w:themeTint="BF"/>
+          <w:kern w:val="24"/>
+        </w:rPr>
+        <w:t xml:space="preserve">2. </w:t>
+      </w:r>
+      <m:oMath>
+        <m:r>
+          <w:rPr>
+            <w:rFonts w:ascii="Cambria Math" w:eastAsiaTheme="minorEastAsia" w:hAnsi="Cambria Math"/>
+            <w:color w:val="404040" w:themeColor="text1" w:themeTint="BF"/>
+            <w:kern w:val="24"/>
+          </w:rPr>
+          <m:t>1.591×0.766</m:t>
+        </m:r>
+        <m:r>
+          <w:rPr>
+            <w:rFonts w:ascii="Cambria Math" w:eastAsiaTheme="minorEastAsia" w:hAnsi="Cambria Math"/>
+            <w:color w:val="404040" w:themeColor="text1" w:themeTint="BF"/>
+            <w:kern w:val="24"/>
+          </w:rPr>
+          <m:t>=</m:t>
+        </m:r>
+        <m:r>
+          <w:rPr>
+            <w:rFonts w:ascii="Cambria Math" w:eastAsiaTheme="minorEastAsia" w:hAnsi="Cambria Math"/>
+            <w:color w:val="404040" w:themeColor="text1" w:themeTint="BF"/>
+            <w:kern w:val="24"/>
+          </w:rPr>
+          <m:t>(J)</m:t>
+        </m:r>
+      </m:oMath>
+    </w:p>
+    <w:p>
+      <w:pPr>
+        <w:pStyle w:val="NormalWeb"/>
         <w:numPr>
           <w:ilvl w:val="0"/>
-          <w:numId w:val="1"/>
+          <w:numId w:val="4"/>
         </w:numPr>
         <w:spacing w:before="200" w:beforeAutospacing="0" w:after="0" w:afterAutospacing="0"/>
         <w:rPr>
@@ -1511,20 +1778,9 @@
           <w:color w:val="404040" w:themeColor="text1" w:themeTint="BF"/>
           <w:kern w:val="24"/>
         </w:rPr>
-        <w:tab/>
+        <w:lastRenderedPageBreak/>
         <w:t xml:space="preserve">From the mass of the cart and change in velocity, determine: </w:t>
       </w:r>
-    </w:p>
-    <w:p>
-      <w:pPr>
-        <w:jc w:val="center"/>
-        <w:rPr>
-          <w:rFonts w:eastAsiaTheme="minorEastAsia"/>
-          <w:iCs/>
-          <w:color w:val="404040" w:themeColor="text1" w:themeTint="BF"/>
-          <w:kern w:val="24"/>
-        </w:rPr>
-      </w:pPr>
       <w:r>
         <w:rPr>
           <w:rFonts w:eastAsiaTheme="minorEastAsia"/>
@@ -1636,44 +1892,526 @@
     </w:p>
     <w:p>
       <w:pPr>
-        <w:jc w:val="center"/>
-        <w:rPr>
-          <w:rFonts w:eastAsiaTheme="minorEastAsia"/>
-          <w:iCs/>
-          <w:color w:val="404040" w:themeColor="text1" w:themeTint="BF"/>
-          <w:kern w:val="24"/>
-        </w:rPr>
-      </w:pPr>
+        <w:pStyle w:val="NormalWeb"/>
+        <w:spacing w:before="200" w:beforeAutospacing="0" w:after="0" w:afterAutospacing="0"/>
+        <w:ind w:left="720"/>
+        <w:rPr>
+          <w:rFonts w:eastAsiaTheme="minorEastAsia"/>
+          <w:color w:val="404040" w:themeColor="text1" w:themeTint="BF"/>
+          <w:kern w:val="24"/>
+        </w:rPr>
+      </w:pPr>
+      <w:r>
+        <w:rPr>
+          <w:rFonts w:eastAsiaTheme="minorEastAsia"/>
+          <w:color w:val="404040" w:themeColor="text1" w:themeTint="BF"/>
+          <w:kern w:val="24"/>
+        </w:rPr>
+        <w:t>Elastic 1:</w:t>
+      </w:r>
+    </w:p>
+    <w:p>
+      <w:pPr>
+        <w:pStyle w:val="NormalWeb"/>
+        <w:spacing w:before="200" w:beforeAutospacing="0" w:after="0" w:afterAutospacing="0"/>
+        <w:ind w:left="720"/>
+        <w:rPr>
+          <w:rFonts w:eastAsiaTheme="minorEastAsia"/>
+          <w:color w:val="404040" w:themeColor="text1" w:themeTint="BF"/>
+          <w:kern w:val="24"/>
+        </w:rPr>
+      </w:pPr>
+      <w:r>
+        <w:rPr>
+          <w:rFonts w:eastAsiaTheme="minorEastAsia"/>
+          <w:color w:val="404040" w:themeColor="text1" w:themeTint="BF"/>
+          <w:kern w:val="24"/>
+        </w:rPr>
+        <w:tab/>
+      </w:r>
+      <w:r>
+        <w:rPr>
+          <w:rFonts w:eastAsiaTheme="minorEastAsia"/>
+          <w:color w:val="404040" w:themeColor="text1" w:themeTint="BF"/>
+          <w:kern w:val="24"/>
+        </w:rPr>
+        <w:t xml:space="preserve">1. </w:t>
+      </w:r>
+      <m:oMath>
+        <m:r>
+          <m:rPr>
+            <m:sty m:val="p"/>
+          </m:rPr>
+          <w:rPr>
+            <w:rFonts w:ascii="Cambria Math" w:hAnsi="Cambria Math"/>
+          </w:rPr>
+          <m:t>0.5083</m:t>
+        </m:r>
+        <m:r>
+          <w:rPr>
+            <w:rFonts w:ascii="Cambria Math" w:eastAsiaTheme="minorEastAsia" w:hAnsi="Cambria Math"/>
+            <w:color w:val="404040" w:themeColor="text1" w:themeTint="BF"/>
+            <w:kern w:val="24"/>
+          </w:rPr>
+          <m:t>×[0.4593-</m:t>
+        </m:r>
+        <m:d>
+          <m:dPr>
+            <m:ctrlPr>
+              <w:rPr>
+                <w:rFonts w:ascii="Cambria Math" w:eastAsiaTheme="minorEastAsia" w:hAnsi="Cambria Math"/>
+                <w:i/>
+                <w:color w:val="404040" w:themeColor="text1" w:themeTint="BF"/>
+                <w:kern w:val="24"/>
+              </w:rPr>
+            </m:ctrlPr>
+          </m:dPr>
+          <m:e>
+            <m:r>
+              <w:rPr>
+                <w:rFonts w:ascii="Cambria Math" w:eastAsiaTheme="minorEastAsia" w:hAnsi="Cambria Math"/>
+                <w:color w:val="404040" w:themeColor="text1" w:themeTint="BF"/>
+                <w:kern w:val="24"/>
+              </w:rPr>
+              <m:t>-0.6051</m:t>
+            </m:r>
+          </m:e>
+        </m:d>
+        <m:r>
+          <w:rPr>
+            <w:rFonts w:ascii="Cambria Math" w:eastAsiaTheme="minorEastAsia" w:hAnsi="Cambria Math"/>
+            <w:color w:val="404040" w:themeColor="text1" w:themeTint="BF"/>
+            <w:kern w:val="24"/>
+          </w:rPr>
+          <m:t>]</m:t>
+        </m:r>
+        <m:r>
+          <w:rPr>
+            <w:rFonts w:ascii="Cambria Math" w:eastAsiaTheme="minorEastAsia" w:hAnsi="Cambria Math"/>
+            <w:color w:val="404040" w:themeColor="text1" w:themeTint="BF"/>
+            <w:kern w:val="24"/>
+          </w:rPr>
+          <m:t>=</m:t>
+        </m:r>
+      </m:oMath>
+      <w:r>
+        <w:rPr>
+          <w:rFonts w:ascii="Aptos Narrow" w:hAnsi="Aptos Narrow"/>
+          <w:color w:val="000000"/>
+        </w:rPr>
+        <w:t xml:space="preserve"> </w:t>
+      </w:r>
+      <w:r>
+        <w:rPr>
+          <w:rFonts w:ascii="Aptos Narrow" w:hAnsi="Aptos Narrow"/>
+          <w:color w:val="000000"/>
+        </w:rPr>
+        <w:t>(</w:t>
+      </w:r>
+      <m:oMath>
+        <m:r>
+          <w:rPr>
+            <w:rFonts w:ascii="Cambria Math" w:hAnsi="Cambria Math"/>
+            <w:color w:val="000000"/>
+          </w:rPr>
+          <m:t>kg⋅m/s</m:t>
+        </m:r>
+      </m:oMath>
+      <w:r>
+        <w:rPr>
+          <w:rFonts w:ascii="Aptos Narrow" w:hAnsi="Aptos Narrow"/>
+          <w:color w:val="000000"/>
+        </w:rPr>
+        <w:t>)</w:t>
+      </w:r>
+    </w:p>
+    <w:p>
+      <w:pPr>
+        <w:pStyle w:val="NormalWeb"/>
+        <w:spacing w:before="200" w:beforeAutospacing="0" w:after="0" w:afterAutospacing="0"/>
+        <w:ind w:left="720"/>
+        <w:rPr>
+          <w:rFonts w:eastAsiaTheme="minorEastAsia"/>
+          <w:color w:val="404040" w:themeColor="text1" w:themeTint="BF"/>
+          <w:kern w:val="24"/>
+        </w:rPr>
+      </w:pPr>
+      <w:r>
+        <w:rPr>
+          <w:rFonts w:eastAsiaTheme="minorEastAsia"/>
+          <w:color w:val="404040" w:themeColor="text1" w:themeTint="BF"/>
+          <w:kern w:val="24"/>
+        </w:rPr>
+        <w:tab/>
+        <w:t xml:space="preserve">2. </w:t>
+      </w:r>
+      <m:oMath>
+        <m:r>
+          <m:rPr>
+            <m:sty m:val="p"/>
+          </m:rPr>
+          <w:rPr>
+            <w:rFonts w:ascii="Cambria Math" w:hAnsi="Cambria Math"/>
+          </w:rPr>
+          <m:t>0.5083</m:t>
+        </m:r>
+        <m:r>
+          <w:rPr>
+            <w:rFonts w:ascii="Cambria Math" w:eastAsiaTheme="minorEastAsia" w:hAnsi="Cambria Math"/>
+            <w:color w:val="404040" w:themeColor="text1" w:themeTint="BF"/>
+            <w:kern w:val="24"/>
+          </w:rPr>
+          <m:t>×[</m:t>
+        </m:r>
+        <m:r>
+          <w:rPr>
+            <w:rFonts w:ascii="Cambria Math" w:eastAsiaTheme="minorEastAsia" w:hAnsi="Cambria Math"/>
+            <w:color w:val="404040" w:themeColor="text1" w:themeTint="BF"/>
+            <w:kern w:val="24"/>
+          </w:rPr>
+          <m:t>0.5076</m:t>
+        </m:r>
+        <m:r>
+          <w:rPr>
+            <w:rFonts w:ascii="Cambria Math" w:eastAsiaTheme="minorEastAsia" w:hAnsi="Cambria Math"/>
+            <w:color w:val="404040" w:themeColor="text1" w:themeTint="BF"/>
+            <w:kern w:val="24"/>
+          </w:rPr>
+          <m:t>-</m:t>
+        </m:r>
+        <m:d>
+          <m:dPr>
+            <m:ctrlPr>
+              <w:rPr>
+                <w:rFonts w:ascii="Cambria Math" w:eastAsiaTheme="minorEastAsia" w:hAnsi="Cambria Math"/>
+                <w:i/>
+                <w:color w:val="404040" w:themeColor="text1" w:themeTint="BF"/>
+                <w:kern w:val="24"/>
+              </w:rPr>
+            </m:ctrlPr>
+          </m:dPr>
+          <m:e>
+            <m:r>
+              <w:rPr>
+                <w:rFonts w:ascii="Cambria Math" w:eastAsiaTheme="minorEastAsia" w:hAnsi="Cambria Math"/>
+                <w:color w:val="404040" w:themeColor="text1" w:themeTint="BF"/>
+                <w:kern w:val="24"/>
+              </w:rPr>
+              <m:t>-0.709</m:t>
+            </m:r>
+          </m:e>
+        </m:d>
+        <m:r>
+          <w:rPr>
+            <w:rFonts w:ascii="Cambria Math" w:eastAsiaTheme="minorEastAsia" w:hAnsi="Cambria Math"/>
+            <w:color w:val="404040" w:themeColor="text1" w:themeTint="BF"/>
+            <w:kern w:val="24"/>
+          </w:rPr>
+          <m:t>]=</m:t>
+        </m:r>
+      </m:oMath>
+      <w:r>
+        <w:rPr>
+          <w:rFonts w:ascii="Aptos Narrow" w:hAnsi="Aptos Narrow"/>
+          <w:color w:val="000000"/>
+        </w:rPr>
+        <w:t xml:space="preserve"> </w:t>
+      </w:r>
+      <w:r>
+        <w:rPr>
+          <w:rFonts w:ascii="Aptos Narrow" w:hAnsi="Aptos Narrow"/>
+          <w:color w:val="000000"/>
+        </w:rPr>
+        <w:t>(</w:t>
+      </w:r>
+      <m:oMath>
+        <m:r>
+          <w:rPr>
+            <w:rFonts w:ascii="Cambria Math" w:hAnsi="Cambria Math"/>
+            <w:color w:val="000000"/>
+          </w:rPr>
+          <m:t>kg⋅m/s</m:t>
+        </m:r>
+      </m:oMath>
+      <w:r>
+        <w:rPr>
+          <w:rFonts w:ascii="Aptos Narrow" w:hAnsi="Aptos Narrow"/>
+          <w:color w:val="000000"/>
+        </w:rPr>
+        <w:t>)</w:t>
+      </w:r>
+    </w:p>
+    <w:p>
+      <w:pPr>
+        <w:pStyle w:val="NormalWeb"/>
+        <w:spacing w:before="200" w:beforeAutospacing="0" w:after="0" w:afterAutospacing="0"/>
+        <w:ind w:left="720"/>
+        <w:rPr>
+          <w:rFonts w:eastAsiaTheme="minorEastAsia"/>
+          <w:color w:val="404040" w:themeColor="text1" w:themeTint="BF"/>
+          <w:kern w:val="24"/>
+        </w:rPr>
+      </w:pPr>
+      <w:r>
+        <w:rPr>
+          <w:rFonts w:eastAsiaTheme="minorEastAsia"/>
+          <w:color w:val="404040" w:themeColor="text1" w:themeTint="BF"/>
+          <w:kern w:val="24"/>
+        </w:rPr>
+        <w:t>Elastic 2:</w:t>
+      </w:r>
+    </w:p>
+    <w:p>
+      <w:pPr>
+        <w:pStyle w:val="NormalWeb"/>
+        <w:spacing w:before="200" w:beforeAutospacing="0" w:after="0" w:afterAutospacing="0"/>
+        <w:ind w:left="720"/>
+        <w:rPr>
+          <w:rFonts w:eastAsiaTheme="minorEastAsia"/>
+          <w:color w:val="404040" w:themeColor="text1" w:themeTint="BF"/>
+          <w:kern w:val="24"/>
+        </w:rPr>
+      </w:pPr>
+      <w:r>
+        <w:rPr>
+          <w:rFonts w:eastAsiaTheme="minorEastAsia"/>
+          <w:color w:val="404040" w:themeColor="text1" w:themeTint="BF"/>
+          <w:kern w:val="24"/>
+        </w:rPr>
+        <w:tab/>
+        <w:t xml:space="preserve">1. </w:t>
+      </w:r>
+      <m:oMath>
+        <m:r>
+          <m:rPr>
+            <m:sty m:val="p"/>
+          </m:rPr>
+          <w:rPr>
+            <w:rFonts w:ascii="Cambria Math" w:hAnsi="Cambria Math"/>
+          </w:rPr>
+          <m:t>0.5083</m:t>
+        </m:r>
+        <m:r>
+          <w:rPr>
+            <w:rFonts w:ascii="Cambria Math" w:eastAsiaTheme="minorEastAsia" w:hAnsi="Cambria Math"/>
+            <w:color w:val="404040" w:themeColor="text1" w:themeTint="BF"/>
+            <w:kern w:val="24"/>
+          </w:rPr>
+          <m:t>×[0.</m:t>
+        </m:r>
+        <m:r>
+          <w:rPr>
+            <w:rFonts w:ascii="Cambria Math" w:eastAsiaTheme="minorEastAsia" w:hAnsi="Cambria Math"/>
+            <w:color w:val="404040" w:themeColor="text1" w:themeTint="BF"/>
+            <w:kern w:val="24"/>
+          </w:rPr>
+          <m:t>7931</m:t>
+        </m:r>
+        <m:r>
+          <w:rPr>
+            <w:rFonts w:ascii="Cambria Math" w:eastAsiaTheme="minorEastAsia" w:hAnsi="Cambria Math"/>
+            <w:color w:val="404040" w:themeColor="text1" w:themeTint="BF"/>
+            <w:kern w:val="24"/>
+          </w:rPr>
+          <m:t>-</m:t>
+        </m:r>
+        <m:d>
+          <m:dPr>
+            <m:ctrlPr>
+              <w:rPr>
+                <w:rFonts w:ascii="Cambria Math" w:eastAsiaTheme="minorEastAsia" w:hAnsi="Cambria Math"/>
+                <w:i/>
+                <w:color w:val="404040" w:themeColor="text1" w:themeTint="BF"/>
+                <w:kern w:val="24"/>
+              </w:rPr>
+            </m:ctrlPr>
+          </m:dPr>
+          <m:e>
+            <m:r>
+              <w:rPr>
+                <w:rFonts w:ascii="Cambria Math" w:eastAsiaTheme="minorEastAsia" w:hAnsi="Cambria Math"/>
+                <w:color w:val="404040" w:themeColor="text1" w:themeTint="BF"/>
+                <w:kern w:val="24"/>
+              </w:rPr>
+              <m:t>-0.</m:t>
+            </m:r>
+            <m:r>
+              <w:rPr>
+                <w:rFonts w:ascii="Cambria Math" w:eastAsiaTheme="minorEastAsia" w:hAnsi="Cambria Math"/>
+                <w:color w:val="404040" w:themeColor="text1" w:themeTint="BF"/>
+                <w:kern w:val="24"/>
+              </w:rPr>
+              <m:t>7898</m:t>
+            </m:r>
+          </m:e>
+        </m:d>
+        <m:r>
+          <w:rPr>
+            <w:rFonts w:ascii="Cambria Math" w:eastAsiaTheme="minorEastAsia" w:hAnsi="Cambria Math"/>
+            <w:color w:val="404040" w:themeColor="text1" w:themeTint="BF"/>
+            <w:kern w:val="24"/>
+          </w:rPr>
+          <m:t>]=</m:t>
+        </m:r>
+      </m:oMath>
+      <w:r>
+        <w:rPr>
+          <w:rFonts w:ascii="Aptos Narrow" w:hAnsi="Aptos Narrow"/>
+          <w:color w:val="000000"/>
+        </w:rPr>
+        <w:t xml:space="preserve"> </w:t>
+      </w:r>
+      <w:r>
+        <w:rPr>
+          <w:rFonts w:ascii="Aptos Narrow" w:hAnsi="Aptos Narrow"/>
+          <w:color w:val="000000"/>
+        </w:rPr>
+        <w:t>(</w:t>
+      </w:r>
+      <m:oMath>
+        <m:r>
+          <w:rPr>
+            <w:rFonts w:ascii="Cambria Math" w:hAnsi="Cambria Math"/>
+            <w:color w:val="000000"/>
+          </w:rPr>
+          <m:t>kg⋅m/s</m:t>
+        </m:r>
+      </m:oMath>
+      <w:r>
+        <w:rPr>
+          <w:rFonts w:ascii="Aptos Narrow" w:hAnsi="Aptos Narrow"/>
+          <w:color w:val="000000"/>
+        </w:rPr>
+        <w:t>)</w:t>
+      </w:r>
+    </w:p>
+    <w:p>
+      <w:pPr>
+        <w:pStyle w:val="NormalWeb"/>
+        <w:spacing w:before="200" w:beforeAutospacing="0" w:after="0" w:afterAutospacing="0"/>
+        <w:ind w:left="720" w:firstLine="720"/>
+        <w:rPr>
+          <w:rFonts w:eastAsiaTheme="minorEastAsia"/>
+          <w:color w:val="404040" w:themeColor="text1" w:themeTint="BF"/>
+          <w:kern w:val="24"/>
+        </w:rPr>
+      </w:pPr>
+      <w:r>
+        <w:rPr>
+          <w:rFonts w:eastAsiaTheme="minorEastAsia"/>
+          <w:color w:val="404040" w:themeColor="text1" w:themeTint="BF"/>
+          <w:kern w:val="24"/>
+        </w:rPr>
+        <w:t xml:space="preserve">2. </w:t>
+      </w:r>
+      <m:oMath>
+        <m:r>
+          <m:rPr>
+            <m:sty m:val="p"/>
+          </m:rPr>
+          <w:rPr>
+            <w:rFonts w:ascii="Cambria Math" w:hAnsi="Cambria Math"/>
+          </w:rPr>
+          <m:t>0.5083</m:t>
+        </m:r>
+        <m:r>
+          <w:rPr>
+            <w:rFonts w:ascii="Cambria Math" w:eastAsiaTheme="minorEastAsia" w:hAnsi="Cambria Math"/>
+            <w:color w:val="404040" w:themeColor="text1" w:themeTint="BF"/>
+            <w:kern w:val="24"/>
+          </w:rPr>
+          <m:t>×[</m:t>
+        </m:r>
+        <m:r>
+          <w:rPr>
+            <w:rFonts w:ascii="Cambria Math" w:eastAsiaTheme="minorEastAsia" w:hAnsi="Cambria Math"/>
+            <w:color w:val="404040" w:themeColor="text1" w:themeTint="BF"/>
+            <w:kern w:val="24"/>
+          </w:rPr>
+          <m:t>1.049</m:t>
+        </m:r>
+        <m:r>
+          <w:rPr>
+            <w:rFonts w:ascii="Cambria Math" w:eastAsiaTheme="minorEastAsia" w:hAnsi="Cambria Math"/>
+            <w:color w:val="404040" w:themeColor="text1" w:themeTint="BF"/>
+            <w:kern w:val="24"/>
+          </w:rPr>
+          <m:t>-</m:t>
+        </m:r>
+        <m:d>
+          <m:dPr>
+            <m:ctrlPr>
+              <w:rPr>
+                <w:rFonts w:ascii="Cambria Math" w:eastAsiaTheme="minorEastAsia" w:hAnsi="Cambria Math"/>
+                <w:i/>
+                <w:color w:val="404040" w:themeColor="text1" w:themeTint="BF"/>
+                <w:kern w:val="24"/>
+              </w:rPr>
+            </m:ctrlPr>
+          </m:dPr>
+          <m:e>
+            <m:r>
+              <w:rPr>
+                <w:rFonts w:ascii="Cambria Math" w:eastAsiaTheme="minorEastAsia" w:hAnsi="Cambria Math"/>
+                <w:color w:val="404040" w:themeColor="text1" w:themeTint="BF"/>
+                <w:kern w:val="24"/>
+              </w:rPr>
+              <m:t>-</m:t>
+            </m:r>
+            <m:r>
+              <w:rPr>
+                <w:rFonts w:ascii="Cambria Math" w:eastAsiaTheme="minorEastAsia" w:hAnsi="Cambria Math"/>
+                <w:color w:val="404040" w:themeColor="text1" w:themeTint="BF"/>
+                <w:kern w:val="24"/>
+              </w:rPr>
+              <m:t>1.255</m:t>
+            </m:r>
+          </m:e>
+        </m:d>
+        <m:r>
+          <w:rPr>
+            <w:rFonts w:ascii="Cambria Math" w:eastAsiaTheme="minorEastAsia" w:hAnsi="Cambria Math"/>
+            <w:color w:val="404040" w:themeColor="text1" w:themeTint="BF"/>
+            <w:kern w:val="24"/>
+          </w:rPr>
+          <m:t>]=</m:t>
+        </m:r>
+      </m:oMath>
+      <w:r>
+        <w:rPr>
+          <w:rFonts w:ascii="Aptos Narrow" w:hAnsi="Aptos Narrow"/>
+          <w:color w:val="000000"/>
+        </w:rPr>
+        <w:t xml:space="preserve"> </w:t>
+      </w:r>
+      <w:r>
+        <w:rPr>
+          <w:rFonts w:ascii="Aptos Narrow" w:hAnsi="Aptos Narrow"/>
+          <w:color w:val="000000"/>
+        </w:rPr>
+        <w:t>(</w:t>
+      </w:r>
+      <m:oMath>
+        <m:r>
+          <w:rPr>
+            <w:rFonts w:ascii="Cambria Math" w:hAnsi="Cambria Math"/>
+            <w:color w:val="000000"/>
+          </w:rPr>
+          <m:t>kg⋅m/s</m:t>
+        </m:r>
+      </m:oMath>
+      <w:r>
+        <w:rPr>
+          <w:rFonts w:ascii="Aptos Narrow" w:hAnsi="Aptos Narrow"/>
+          <w:color w:val="000000"/>
+        </w:rPr>
+        <w:t>)</w:t>
+      </w:r>
     </w:p>
     <w:p>
       <w:pPr>
         <w:pStyle w:val="Caption"/>
-        <w:jc w:val="center"/>
-        <w:rPr>
-          <w:b/>
-          <w:bCs/>
-          <w:sz w:val="22"/>
-          <w:szCs w:val="22"/>
-        </w:rPr>
-      </w:pPr>
-      <w:r>
-        <w:rPr>
-          <w:b/>
-          <w:bCs/>
-          <w:sz w:val="22"/>
-          <w:szCs w:val="22"/>
-        </w:rPr>
-        <w:t>Make these calculations for each trial and enter the values in the data table</w:t>
-      </w:r>
-    </w:p>
-    <w:p>
-      <w:pPr>
-        <w:pStyle w:val="Caption"/>
-        <w:jc w:val="center"/>
-      </w:pPr>
-      <w:r>
-        <w:t xml:space="preserve"> </w:t>
-      </w:r>
+      </w:pPr>
     </w:p>
     <w:p>
       <w:pPr>
@@ -1706,171 +2444,1517 @@
         <w:keepNext/>
         <w:jc w:val="center"/>
       </w:pPr>
-      <w:r>
-        <w:rPr>
-          <w:noProof/>
-        </w:rPr>
-        <w:lastRenderedPageBreak/>
-        <w:drawing>
-          <wp:inline distT="0" distB="0" distL="0" distR="0" wp14:anchorId="20129839" wp14:editId="0CEDC5F7">
-            <wp:extent cx="5890260" cy="3109378"/>
-            <wp:effectExtent l="0" t="0" r="0" b="0"/>
-            <wp:docPr id="2120974976" name="Picture 3" descr="A graph showing a function with a curve labeled Δt, indicating a change or difference in time."/>
-            <wp:cNvGraphicFramePr>
-              <a:graphicFrameLocks xmlns:a="http://schemas.openxmlformats.org/drawingml/2006/main" noChangeAspect="1"/>
-            </wp:cNvGraphicFramePr>
-            <a:graphic xmlns:a="http://schemas.openxmlformats.org/drawingml/2006/main">
-              <a:graphicData uri="http://schemas.openxmlformats.org/drawingml/2006/picture">
-                <pic:pic xmlns:pic="http://schemas.openxmlformats.org/drawingml/2006/picture">
-                  <pic:nvPicPr>
-                    <pic:cNvPr id="0" name="Picture 3"/>
-                    <pic:cNvPicPr>
-                      <a:picLocks noChangeAspect="1" noChangeArrowheads="1"/>
-                    </pic:cNvPicPr>
-                  </pic:nvPicPr>
-                  <pic:blipFill>
-                    <a:blip r:embed="rId6" cstate="print">
-                      <a:extLst>
-                        <a:ext uri="{28A0092B-C50C-407E-A947-70E740481C1C}">
-                          <a14:useLocalDpi xmlns:a14="http://schemas.microsoft.com/office/drawing/2010/main" val="0"/>
-                        </a:ext>
-                      </a:extLst>
-                    </a:blip>
-                    <a:srcRect/>
-                    <a:stretch>
-                      <a:fillRect/>
-                    </a:stretch>
-                  </pic:blipFill>
-                  <pic:spPr bwMode="auto">
-                    <a:xfrm>
-                      <a:off x="0" y="0"/>
-                      <a:ext cx="5893038" cy="3110844"/>
-                    </a:xfrm>
-                    <a:prstGeom prst="rect">
-                      <a:avLst/>
-                    </a:prstGeom>
-                    <a:noFill/>
-                    <a:ln>
-                      <a:noFill/>
-                    </a:ln>
-                  </pic:spPr>
-                </pic:pic>
-              </a:graphicData>
-            </a:graphic>
-          </wp:inline>
-        </w:drawing>
+    </w:p>
+    <w:tbl>
+      <w:tblPr>
+        <w:tblW w:w="8905" w:type="dxa"/>
+        <w:tblLook w:val="04A0" w:firstRow="1" w:lastRow="0" w:firstColumn="1" w:lastColumn="0" w:noHBand="0" w:noVBand="1"/>
+      </w:tblPr>
+      <w:tblGrid>
+        <w:gridCol w:w="1075"/>
+        <w:gridCol w:w="1260"/>
+        <w:gridCol w:w="2520"/>
+        <w:gridCol w:w="4050"/>
+      </w:tblGrid>
+      <w:tr>
+        <w:trPr>
+          <w:trHeight w:val="431"/>
+        </w:trPr>
+        <w:tc>
+          <w:tcPr>
+            <w:tcW w:w="1075" w:type="dxa"/>
+            <w:tcBorders>
+              <w:top w:val="single" w:sz="4" w:space="0" w:color="auto"/>
+              <w:left w:val="single" w:sz="4" w:space="0" w:color="auto"/>
+              <w:bottom w:val="single" w:sz="4" w:space="0" w:color="auto"/>
+              <w:right w:val="single" w:sz="4" w:space="0" w:color="auto"/>
+            </w:tcBorders>
+            <w:shd w:val="clear" w:color="auto" w:fill="auto"/>
+            <w:noWrap/>
+            <w:vAlign w:val="bottom"/>
+            <w:hideMark/>
+          </w:tcPr>
+          <w:p>
+            <w:pPr>
+              <w:jc w:val="center"/>
+              <w:rPr>
+                <w:rFonts w:ascii="Aptos Narrow" w:hAnsi="Aptos Narrow"/>
+                <w:color w:val="000000"/>
+                <w:sz w:val="22"/>
+                <w:szCs w:val="22"/>
+              </w:rPr>
+            </w:pPr>
+            <w:r>
+              <w:rPr>
+                <w:rFonts w:ascii="Aptos Narrow" w:hAnsi="Aptos Narrow"/>
+                <w:color w:val="000000"/>
+                <w:sz w:val="22"/>
+                <w:szCs w:val="22"/>
+              </w:rPr>
+              <w:t>Trial</w:t>
+            </w:r>
+          </w:p>
+        </w:tc>
+        <w:tc>
+          <w:tcPr>
+            <w:tcW w:w="1260" w:type="dxa"/>
+            <w:vMerge w:val="restart"/>
+            <w:tcBorders>
+              <w:top w:val="single" w:sz="4" w:space="0" w:color="auto"/>
+              <w:left w:val="single" w:sz="4" w:space="0" w:color="auto"/>
+              <w:bottom w:val="single" w:sz="4" w:space="0" w:color="auto"/>
+              <w:right w:val="single" w:sz="4" w:space="0" w:color="auto"/>
+            </w:tcBorders>
+            <w:shd w:val="clear" w:color="auto" w:fill="auto"/>
+            <w:noWrap/>
+            <w:vAlign w:val="bottom"/>
+            <w:hideMark/>
+          </w:tcPr>
+          <w:p>
+            <w:pPr>
+              <w:jc w:val="center"/>
+              <w:rPr>
+                <w:rFonts w:ascii="Aptos Narrow" w:hAnsi="Aptos Narrow"/>
+                <w:color w:val="000000"/>
+                <w:sz w:val="22"/>
+                <w:szCs w:val="22"/>
+              </w:rPr>
+            </w:pPr>
+            <w:r>
+              <w:rPr>
+                <w:rFonts w:ascii="Aptos Narrow" w:hAnsi="Aptos Narrow"/>
+                <w:color w:val="000000"/>
+                <w:sz w:val="22"/>
+                <w:szCs w:val="22"/>
+              </w:rPr>
+              <w:t>Impulse</w:t>
+            </w:r>
+            <w:r>
+              <w:rPr>
+                <w:rFonts w:ascii="Aptos Narrow" w:hAnsi="Aptos Narrow"/>
+                <w:color w:val="000000"/>
+                <w:sz w:val="22"/>
+                <w:szCs w:val="22"/>
+              </w:rPr>
+              <w:br/>
+            </w:r>
+            <m:oMathPara>
+              <m:oMath>
+                <m:sSub>
+                  <m:sSubPr>
+                    <m:ctrlPr>
+                      <w:rPr>
+                        <w:rFonts w:ascii="Cambria Math" w:hAnsi="Cambria Math"/>
+                        <w:i/>
+                      </w:rPr>
+                    </m:ctrlPr>
+                  </m:sSubPr>
+                  <m:e>
+                    <m:r>
+                      <w:rPr>
+                        <w:rFonts w:ascii="Cambria Math" w:hAnsi="Cambria Math"/>
+                      </w:rPr>
+                      <m:t>F</m:t>
+                    </m:r>
+                  </m:e>
+                  <m:sub>
+                    <m:r>
+                      <w:rPr>
+                        <w:rFonts w:ascii="Cambria Math" w:hAnsi="Cambria Math"/>
+                      </w:rPr>
+                      <m:t>ave</m:t>
+                    </m:r>
+                  </m:sub>
+                </m:sSub>
+                <m:r>
+                  <w:rPr>
+                    <w:rFonts w:ascii="Cambria Math" w:hAnsi="Cambria Math"/>
+                  </w:rPr>
+                  <m:t>Δt</m:t>
+                </m:r>
+              </m:oMath>
+            </m:oMathPara>
+          </w:p>
+          <w:p>
+            <w:pPr>
+              <w:jc w:val="center"/>
+              <w:rPr>
+                <w:rFonts w:ascii="Aptos Narrow" w:hAnsi="Aptos Narrow"/>
+                <w:color w:val="000000"/>
+                <w:sz w:val="22"/>
+                <w:szCs w:val="22"/>
+              </w:rPr>
+            </w:pPr>
+            <w:r>
+              <w:rPr>
+                <w:rFonts w:ascii="Aptos Narrow" w:hAnsi="Aptos Narrow"/>
+                <w:color w:val="000000"/>
+                <w:sz w:val="22"/>
+                <w:szCs w:val="22"/>
+              </w:rPr>
+              <w:t>(</w:t>
+            </w:r>
+            <w:r>
+              <w:rPr>
+                <w:rFonts w:ascii="Aptos Narrow" w:hAnsi="Aptos Narrow"/>
+                <w:color w:val="000000"/>
+                <w:sz w:val="22"/>
+                <w:szCs w:val="22"/>
+              </w:rPr>
+              <w:t>J</w:t>
+            </w:r>
+            <w:r>
+              <w:rPr>
+                <w:rFonts w:ascii="Aptos Narrow" w:hAnsi="Aptos Narrow"/>
+                <w:color w:val="000000"/>
+                <w:sz w:val="22"/>
+                <w:szCs w:val="22"/>
+              </w:rPr>
+              <w:t>)</w:t>
+            </w:r>
+          </w:p>
+        </w:tc>
+        <w:tc>
+          <w:tcPr>
+            <w:tcW w:w="2520" w:type="dxa"/>
+            <w:vMerge w:val="restart"/>
+            <w:tcBorders>
+              <w:top w:val="single" w:sz="4" w:space="0" w:color="auto"/>
+              <w:left w:val="single" w:sz="4" w:space="0" w:color="auto"/>
+              <w:bottom w:val="single" w:sz="4" w:space="0" w:color="auto"/>
+              <w:right w:val="single" w:sz="4" w:space="0" w:color="auto"/>
+            </w:tcBorders>
+            <w:shd w:val="clear" w:color="auto" w:fill="auto"/>
+            <w:noWrap/>
+            <w:vAlign w:val="bottom"/>
+            <w:hideMark/>
+          </w:tcPr>
+          <w:p>
+            <w:pPr>
+              <w:jc w:val="center"/>
+              <w:rPr>
+                <w:rFonts w:ascii="Aptos Narrow" w:hAnsi="Aptos Narrow"/>
+                <w:color w:val="000000"/>
+                <w:sz w:val="22"/>
+                <w:szCs w:val="22"/>
+              </w:rPr>
+            </w:pPr>
+            <w:r>
+              <w:rPr>
+                <w:rFonts w:ascii="Aptos Narrow" w:hAnsi="Aptos Narrow"/>
+                <w:color w:val="000000"/>
+                <w:sz w:val="22"/>
+                <w:szCs w:val="22"/>
+              </w:rPr>
+              <w:t xml:space="preserve">Change in momentum </w:t>
+            </w:r>
+            <m:oMath>
+              <m:r>
+                <w:rPr>
+                  <w:rFonts w:ascii="Cambria Math" w:hAnsi="Cambria Math"/>
+                </w:rPr>
+                <m:t>m</m:t>
+              </m:r>
+              <m:d>
+                <m:dPr>
+                  <m:ctrlPr>
+                    <w:rPr>
+                      <w:rFonts w:ascii="Cambria Math" w:hAnsi="Cambria Math"/>
+                      <w:i/>
+                    </w:rPr>
+                  </m:ctrlPr>
+                </m:dPr>
+                <m:e>
+                  <m:sSub>
+                    <m:sSubPr>
+                      <m:ctrlPr>
+                        <w:rPr>
+                          <w:rFonts w:ascii="Cambria Math" w:hAnsi="Cambria Math"/>
+                          <w:i/>
+                        </w:rPr>
+                      </m:ctrlPr>
+                    </m:sSubPr>
+                    <m:e>
+                      <m:r>
+                        <w:rPr>
+                          <w:rFonts w:ascii="Cambria Math" w:hAnsi="Cambria Math"/>
+                        </w:rPr>
+                        <m:t>v</m:t>
+                      </m:r>
+                    </m:e>
+                    <m:sub>
+                      <m:r>
+                        <w:rPr>
+                          <w:rFonts w:ascii="Cambria Math" w:hAnsi="Cambria Math"/>
+                        </w:rPr>
+                        <m:t>f</m:t>
+                      </m:r>
+                    </m:sub>
+                  </m:sSub>
+                  <m:r>
+                    <w:rPr>
+                      <w:rFonts w:ascii="Cambria Math" w:hAnsi="Cambria Math"/>
+                    </w:rPr>
+                    <m:t>-</m:t>
+                  </m:r>
+                  <m:sSub>
+                    <m:sSubPr>
+                      <m:ctrlPr>
+                        <w:rPr>
+                          <w:rFonts w:ascii="Cambria Math" w:hAnsi="Cambria Math"/>
+                          <w:i/>
+                        </w:rPr>
+                      </m:ctrlPr>
+                    </m:sSubPr>
+                    <m:e>
+                      <m:r>
+                        <w:rPr>
+                          <w:rFonts w:ascii="Cambria Math" w:hAnsi="Cambria Math"/>
+                        </w:rPr>
+                        <m:t>v</m:t>
+                      </m:r>
+                    </m:e>
+                    <m:sub>
+                      <m:r>
+                        <w:rPr>
+                          <w:rFonts w:ascii="Cambria Math" w:hAnsi="Cambria Math"/>
+                        </w:rPr>
+                        <m:t>i</m:t>
+                      </m:r>
+                    </m:sub>
+                  </m:sSub>
+                </m:e>
+              </m:d>
+            </m:oMath>
+          </w:p>
+          <w:p>
+            <w:pPr>
+              <w:jc w:val="center"/>
+              <w:rPr>
+                <w:rFonts w:ascii="Aptos Narrow" w:hAnsi="Aptos Narrow"/>
+                <w:color w:val="000000"/>
+                <w:sz w:val="22"/>
+                <w:szCs w:val="22"/>
+              </w:rPr>
+            </w:pPr>
+            <w:r>
+              <w:rPr>
+                <w:rFonts w:ascii="Aptos Narrow" w:hAnsi="Aptos Narrow"/>
+                <w:color w:val="000000"/>
+                <w:sz w:val="22"/>
+                <w:szCs w:val="22"/>
+              </w:rPr>
+              <w:t>(</w:t>
+            </w:r>
+            <m:oMath>
+              <m:r>
+                <w:rPr>
+                  <w:rFonts w:ascii="Cambria Math" w:hAnsi="Cambria Math"/>
+                  <w:color w:val="000000"/>
+                  <w:sz w:val="22"/>
+                  <w:szCs w:val="22"/>
+                </w:rPr>
+                <m:t>kg⋅</m:t>
+              </m:r>
+              <m:r>
+                <w:rPr>
+                  <w:rFonts w:ascii="Cambria Math" w:hAnsi="Cambria Math"/>
+                  <w:color w:val="000000"/>
+                  <w:sz w:val="22"/>
+                  <w:szCs w:val="22"/>
+                </w:rPr>
+                <m:t>m/</m:t>
+              </m:r>
+              <m:r>
+                <w:rPr>
+                  <w:rFonts w:ascii="Cambria Math" w:hAnsi="Cambria Math"/>
+                  <w:color w:val="000000"/>
+                  <w:sz w:val="22"/>
+                  <w:szCs w:val="22"/>
+                </w:rPr>
+                <m:t>s</m:t>
+              </m:r>
+            </m:oMath>
+            <w:r>
+              <w:rPr>
+                <w:rFonts w:ascii="Aptos Narrow" w:hAnsi="Aptos Narrow"/>
+                <w:color w:val="000000"/>
+                <w:sz w:val="22"/>
+                <w:szCs w:val="22"/>
+              </w:rPr>
+              <w:t>)</w:t>
+            </w:r>
+          </w:p>
+        </w:tc>
+        <w:tc>
+          <w:tcPr>
+            <w:tcW w:w="4050" w:type="dxa"/>
+            <w:vMerge w:val="restart"/>
+            <w:tcBorders>
+              <w:top w:val="single" w:sz="4" w:space="0" w:color="auto"/>
+              <w:left w:val="single" w:sz="4" w:space="0" w:color="auto"/>
+              <w:bottom w:val="single" w:sz="4" w:space="0" w:color="auto"/>
+              <w:right w:val="single" w:sz="4" w:space="0" w:color="auto"/>
+            </w:tcBorders>
+            <w:shd w:val="clear" w:color="auto" w:fill="auto"/>
+            <w:noWrap/>
+            <w:vAlign w:val="bottom"/>
+            <w:hideMark/>
+          </w:tcPr>
+          <w:p>
+            <w:pPr>
+              <w:jc w:val="center"/>
+              <w:rPr>
+                <w:rFonts w:ascii="Aptos Narrow" w:hAnsi="Aptos Narrow"/>
+                <w:color w:val="000000"/>
+                <w:sz w:val="22"/>
+                <w:szCs w:val="22"/>
+              </w:rPr>
+            </w:pPr>
+            <w:r>
+              <w:rPr>
+                <w:rFonts w:ascii="Aptos Narrow" w:hAnsi="Aptos Narrow"/>
+                <w:color w:val="000000"/>
+                <w:sz w:val="22"/>
+                <w:szCs w:val="22"/>
+              </w:rPr>
+              <w:t>% Difference between</w:t>
+            </w:r>
+          </w:p>
+          <w:p>
+            <w:pPr>
+              <w:jc w:val="center"/>
+              <w:rPr>
+                <w:rFonts w:ascii="Aptos Narrow" w:hAnsi="Aptos Narrow"/>
+                <w:color w:val="000000"/>
+                <w:sz w:val="22"/>
+                <w:szCs w:val="22"/>
+              </w:rPr>
+            </w:pPr>
+            <w:r>
+              <w:rPr>
+                <w:rFonts w:ascii="Aptos Narrow" w:hAnsi="Aptos Narrow"/>
+                <w:color w:val="000000"/>
+                <w:sz w:val="22"/>
+                <w:szCs w:val="22"/>
+              </w:rPr>
+              <w:t xml:space="preserve">Impulse and Change in </w:t>
+            </w:r>
+            <w:r>
+              <w:rPr>
+                <w:rFonts w:ascii="Aptos Narrow" w:hAnsi="Aptos Narrow"/>
+                <w:color w:val="000000"/>
+                <w:sz w:val="22"/>
+                <w:szCs w:val="22"/>
+              </w:rPr>
+              <w:t>M</w:t>
+            </w:r>
+            <w:r>
+              <w:rPr>
+                <w:rFonts w:ascii="Aptos Narrow" w:hAnsi="Aptos Narrow"/>
+                <w:color w:val="000000"/>
+                <w:sz w:val="22"/>
+                <w:szCs w:val="22"/>
+              </w:rPr>
+              <w:t>omentum</w:t>
+            </w:r>
+          </w:p>
+          <w:p>
+            <w:pPr>
+              <w:jc w:val="center"/>
+              <w:rPr>
+                <w:rFonts w:ascii="Aptos Narrow" w:hAnsi="Aptos Narrow"/>
+                <w:color w:val="000000"/>
+                <w:sz w:val="22"/>
+                <w:szCs w:val="22"/>
+              </w:rPr>
+            </w:pPr>
+            <w:r>
+              <w:rPr>
+                <w:rFonts w:ascii="Aptos Narrow" w:hAnsi="Aptos Narrow"/>
+                <w:color w:val="000000"/>
+                <w:sz w:val="22"/>
+                <w:szCs w:val="22"/>
+              </w:rPr>
+              <w:t>(%)</w:t>
+            </w:r>
+          </w:p>
+        </w:tc>
+      </w:tr>
+      <w:tr>
+        <w:trPr>
+          <w:trHeight w:val="288"/>
+        </w:trPr>
+        <w:tc>
+          <w:tcPr>
+            <w:tcW w:w="1075" w:type="dxa"/>
+            <w:tcBorders>
+              <w:top w:val="nil"/>
+              <w:left w:val="single" w:sz="4" w:space="0" w:color="auto"/>
+              <w:bottom w:val="single" w:sz="4" w:space="0" w:color="auto"/>
+              <w:right w:val="single" w:sz="4" w:space="0" w:color="auto"/>
+            </w:tcBorders>
+            <w:shd w:val="clear" w:color="auto" w:fill="auto"/>
+            <w:noWrap/>
+            <w:vAlign w:val="bottom"/>
+            <w:hideMark/>
+          </w:tcPr>
+          <w:p>
+            <w:pPr>
+              <w:jc w:val="center"/>
+              <w:rPr>
+                <w:rFonts w:ascii="Aptos Narrow" w:hAnsi="Aptos Narrow"/>
+                <w:color w:val="000000"/>
+                <w:sz w:val="22"/>
+                <w:szCs w:val="22"/>
+              </w:rPr>
+            </w:pPr>
+            <w:r>
+              <w:rPr>
+                <w:rFonts w:ascii="Aptos Narrow" w:hAnsi="Aptos Narrow"/>
+                <w:color w:val="000000"/>
+                <w:sz w:val="22"/>
+                <w:szCs w:val="22"/>
+              </w:rPr>
+              <w:t>Elastic 1</w:t>
+            </w:r>
+          </w:p>
+        </w:tc>
+        <w:tc>
+          <w:tcPr>
+            <w:tcW w:w="1260" w:type="dxa"/>
+            <w:vMerge/>
+            <w:tcBorders>
+              <w:top w:val="single" w:sz="4" w:space="0" w:color="auto"/>
+              <w:left w:val="single" w:sz="4" w:space="0" w:color="auto"/>
+              <w:bottom w:val="single" w:sz="4" w:space="0" w:color="auto"/>
+              <w:right w:val="single" w:sz="4" w:space="0" w:color="auto"/>
+            </w:tcBorders>
+            <w:vAlign w:val="center"/>
+            <w:hideMark/>
+          </w:tcPr>
+          <w:p>
+            <w:pPr>
+              <w:jc w:val="center"/>
+              <w:rPr>
+                <w:rFonts w:ascii="Aptos Narrow" w:hAnsi="Aptos Narrow"/>
+                <w:color w:val="000000"/>
+                <w:sz w:val="22"/>
+                <w:szCs w:val="22"/>
+              </w:rPr>
+            </w:pPr>
+          </w:p>
+        </w:tc>
+        <w:tc>
+          <w:tcPr>
+            <w:tcW w:w="2520" w:type="dxa"/>
+            <w:vMerge/>
+            <w:tcBorders>
+              <w:top w:val="single" w:sz="4" w:space="0" w:color="auto"/>
+              <w:left w:val="single" w:sz="4" w:space="0" w:color="auto"/>
+              <w:bottom w:val="single" w:sz="4" w:space="0" w:color="auto"/>
+              <w:right w:val="single" w:sz="4" w:space="0" w:color="auto"/>
+            </w:tcBorders>
+            <w:vAlign w:val="center"/>
+            <w:hideMark/>
+          </w:tcPr>
+          <w:p>
+            <w:pPr>
+              <w:jc w:val="center"/>
+              <w:rPr>
+                <w:rFonts w:ascii="Aptos Narrow" w:hAnsi="Aptos Narrow"/>
+                <w:color w:val="000000"/>
+                <w:sz w:val="22"/>
+                <w:szCs w:val="22"/>
+              </w:rPr>
+            </w:pPr>
+          </w:p>
+        </w:tc>
+        <w:tc>
+          <w:tcPr>
+            <w:tcW w:w="4050" w:type="dxa"/>
+            <w:vMerge/>
+            <w:tcBorders>
+              <w:top w:val="single" w:sz="4" w:space="0" w:color="auto"/>
+              <w:left w:val="single" w:sz="4" w:space="0" w:color="auto"/>
+              <w:bottom w:val="single" w:sz="4" w:space="0" w:color="auto"/>
+              <w:right w:val="single" w:sz="4" w:space="0" w:color="auto"/>
+            </w:tcBorders>
+            <w:vAlign w:val="center"/>
+            <w:hideMark/>
+          </w:tcPr>
+          <w:p>
+            <w:pPr>
+              <w:jc w:val="center"/>
+              <w:rPr>
+                <w:rFonts w:ascii="Aptos Narrow" w:hAnsi="Aptos Narrow"/>
+                <w:color w:val="000000"/>
+                <w:sz w:val="22"/>
+                <w:szCs w:val="22"/>
+              </w:rPr>
+            </w:pPr>
+          </w:p>
+        </w:tc>
+      </w:tr>
+      <w:tr>
+        <w:trPr>
+          <w:trHeight w:val="288"/>
+        </w:trPr>
+        <w:tc>
+          <w:tcPr>
+            <w:tcW w:w="1075" w:type="dxa"/>
+            <w:tcBorders>
+              <w:top w:val="nil"/>
+              <w:left w:val="single" w:sz="4" w:space="0" w:color="auto"/>
+              <w:bottom w:val="single" w:sz="4" w:space="0" w:color="auto"/>
+              <w:right w:val="single" w:sz="4" w:space="0" w:color="auto"/>
+            </w:tcBorders>
+            <w:shd w:val="clear" w:color="auto" w:fill="auto"/>
+            <w:noWrap/>
+            <w:vAlign w:val="bottom"/>
+            <w:hideMark/>
+          </w:tcPr>
+          <w:p>
+            <w:pPr>
+              <w:jc w:val="center"/>
+              <w:rPr>
+                <w:rFonts w:ascii="Aptos Narrow" w:hAnsi="Aptos Narrow"/>
+                <w:color w:val="000000"/>
+                <w:sz w:val="22"/>
+                <w:szCs w:val="22"/>
+              </w:rPr>
+            </w:pPr>
+            <w:r>
+              <w:rPr>
+                <w:rFonts w:ascii="Aptos Narrow" w:hAnsi="Aptos Narrow"/>
+                <w:color w:val="000000"/>
+                <w:sz w:val="22"/>
+                <w:szCs w:val="22"/>
+              </w:rPr>
+              <w:t>1</w:t>
+            </w:r>
+          </w:p>
+        </w:tc>
+        <w:tc>
+          <w:tcPr>
+            <w:tcW w:w="1260" w:type="dxa"/>
+            <w:tcBorders>
+              <w:top w:val="nil"/>
+              <w:left w:val="nil"/>
+              <w:bottom w:val="single" w:sz="4" w:space="0" w:color="auto"/>
+              <w:right w:val="single" w:sz="4" w:space="0" w:color="auto"/>
+            </w:tcBorders>
+            <w:shd w:val="clear" w:color="auto" w:fill="auto"/>
+            <w:noWrap/>
+            <w:vAlign w:val="bottom"/>
+            <w:hideMark/>
+          </w:tcPr>
+          <w:p>
+            <w:pPr>
+              <w:jc w:val="center"/>
+              <w:rPr>
+                <w:rFonts w:ascii="Aptos Narrow" w:hAnsi="Aptos Narrow"/>
+                <w:color w:val="000000"/>
+                <w:sz w:val="22"/>
+                <w:szCs w:val="22"/>
+              </w:rPr>
+            </w:pPr>
+          </w:p>
+        </w:tc>
+        <w:tc>
+          <w:tcPr>
+            <w:tcW w:w="2520" w:type="dxa"/>
+            <w:tcBorders>
+              <w:top w:val="nil"/>
+              <w:left w:val="nil"/>
+              <w:bottom w:val="single" w:sz="4" w:space="0" w:color="auto"/>
+              <w:right w:val="single" w:sz="4" w:space="0" w:color="auto"/>
+            </w:tcBorders>
+            <w:shd w:val="clear" w:color="auto" w:fill="auto"/>
+            <w:noWrap/>
+            <w:vAlign w:val="bottom"/>
+            <w:hideMark/>
+          </w:tcPr>
+          <w:p>
+            <w:pPr>
+              <w:jc w:val="center"/>
+              <w:rPr>
+                <w:rFonts w:ascii="Aptos Narrow" w:hAnsi="Aptos Narrow"/>
+                <w:color w:val="000000"/>
+                <w:sz w:val="22"/>
+                <w:szCs w:val="22"/>
+              </w:rPr>
+            </w:pPr>
+          </w:p>
+        </w:tc>
+        <w:tc>
+          <w:tcPr>
+            <w:tcW w:w="4050" w:type="dxa"/>
+            <w:tcBorders>
+              <w:top w:val="nil"/>
+              <w:left w:val="nil"/>
+              <w:bottom w:val="single" w:sz="4" w:space="0" w:color="auto"/>
+              <w:right w:val="single" w:sz="4" w:space="0" w:color="auto"/>
+            </w:tcBorders>
+            <w:shd w:val="clear" w:color="auto" w:fill="auto"/>
+            <w:noWrap/>
+            <w:vAlign w:val="bottom"/>
+            <w:hideMark/>
+          </w:tcPr>
+          <w:p>
+            <w:pPr>
+              <w:jc w:val="center"/>
+              <w:rPr>
+                <w:rFonts w:ascii="Aptos Narrow" w:hAnsi="Aptos Narrow"/>
+                <w:color w:val="000000"/>
+                <w:sz w:val="22"/>
+                <w:szCs w:val="22"/>
+              </w:rPr>
+            </w:pPr>
+          </w:p>
+        </w:tc>
+      </w:tr>
+      <w:tr>
+        <w:trPr>
+          <w:trHeight w:val="288"/>
+        </w:trPr>
+        <w:tc>
+          <w:tcPr>
+            <w:tcW w:w="1075" w:type="dxa"/>
+            <w:tcBorders>
+              <w:top w:val="nil"/>
+              <w:left w:val="single" w:sz="4" w:space="0" w:color="auto"/>
+              <w:bottom w:val="single" w:sz="4" w:space="0" w:color="auto"/>
+              <w:right w:val="single" w:sz="4" w:space="0" w:color="auto"/>
+            </w:tcBorders>
+            <w:shd w:val="clear" w:color="auto" w:fill="auto"/>
+            <w:noWrap/>
+            <w:vAlign w:val="bottom"/>
+            <w:hideMark/>
+          </w:tcPr>
+          <w:p>
+            <w:pPr>
+              <w:jc w:val="center"/>
+              <w:rPr>
+                <w:rFonts w:ascii="Aptos Narrow" w:hAnsi="Aptos Narrow"/>
+                <w:color w:val="000000"/>
+                <w:sz w:val="22"/>
+                <w:szCs w:val="22"/>
+              </w:rPr>
+            </w:pPr>
+            <w:r>
+              <w:rPr>
+                <w:rFonts w:ascii="Aptos Narrow" w:hAnsi="Aptos Narrow"/>
+                <w:color w:val="000000"/>
+                <w:sz w:val="22"/>
+                <w:szCs w:val="22"/>
+              </w:rPr>
+              <w:t>2</w:t>
+            </w:r>
+          </w:p>
+        </w:tc>
+        <w:tc>
+          <w:tcPr>
+            <w:tcW w:w="1260" w:type="dxa"/>
+            <w:tcBorders>
+              <w:top w:val="nil"/>
+              <w:left w:val="nil"/>
+              <w:bottom w:val="single" w:sz="4" w:space="0" w:color="auto"/>
+              <w:right w:val="single" w:sz="4" w:space="0" w:color="auto"/>
+            </w:tcBorders>
+            <w:shd w:val="clear" w:color="auto" w:fill="auto"/>
+            <w:noWrap/>
+            <w:vAlign w:val="bottom"/>
+            <w:hideMark/>
+          </w:tcPr>
+          <w:p>
+            <w:pPr>
+              <w:jc w:val="center"/>
+              <w:rPr>
+                <w:rFonts w:ascii="Aptos Narrow" w:hAnsi="Aptos Narrow"/>
+                <w:color w:val="000000"/>
+                <w:sz w:val="22"/>
+                <w:szCs w:val="22"/>
+              </w:rPr>
+            </w:pPr>
+          </w:p>
+        </w:tc>
+        <w:tc>
+          <w:tcPr>
+            <w:tcW w:w="2520" w:type="dxa"/>
+            <w:tcBorders>
+              <w:top w:val="nil"/>
+              <w:left w:val="nil"/>
+              <w:bottom w:val="single" w:sz="4" w:space="0" w:color="auto"/>
+              <w:right w:val="single" w:sz="4" w:space="0" w:color="auto"/>
+            </w:tcBorders>
+            <w:shd w:val="clear" w:color="auto" w:fill="auto"/>
+            <w:noWrap/>
+            <w:vAlign w:val="bottom"/>
+            <w:hideMark/>
+          </w:tcPr>
+          <w:p>
+            <w:pPr>
+              <w:jc w:val="center"/>
+              <w:rPr>
+                <w:rFonts w:ascii="Aptos Narrow" w:hAnsi="Aptos Narrow"/>
+                <w:color w:val="000000"/>
+                <w:sz w:val="22"/>
+                <w:szCs w:val="22"/>
+              </w:rPr>
+            </w:pPr>
+          </w:p>
+        </w:tc>
+        <w:tc>
+          <w:tcPr>
+            <w:tcW w:w="4050" w:type="dxa"/>
+            <w:tcBorders>
+              <w:top w:val="nil"/>
+              <w:left w:val="nil"/>
+              <w:bottom w:val="single" w:sz="4" w:space="0" w:color="auto"/>
+              <w:right w:val="single" w:sz="4" w:space="0" w:color="auto"/>
+            </w:tcBorders>
+            <w:shd w:val="clear" w:color="auto" w:fill="auto"/>
+            <w:noWrap/>
+            <w:vAlign w:val="bottom"/>
+            <w:hideMark/>
+          </w:tcPr>
+          <w:p>
+            <w:pPr>
+              <w:jc w:val="center"/>
+              <w:rPr>
+                <w:rFonts w:ascii="Aptos Narrow" w:hAnsi="Aptos Narrow"/>
+                <w:color w:val="000000"/>
+                <w:sz w:val="22"/>
+                <w:szCs w:val="22"/>
+              </w:rPr>
+            </w:pPr>
+          </w:p>
+        </w:tc>
+      </w:tr>
+      <w:tr>
+        <w:trPr>
+          <w:trHeight w:val="288"/>
+        </w:trPr>
+        <w:tc>
+          <w:tcPr>
+            <w:tcW w:w="1075" w:type="dxa"/>
+            <w:tcBorders>
+              <w:top w:val="nil"/>
+              <w:left w:val="single" w:sz="4" w:space="0" w:color="auto"/>
+              <w:bottom w:val="single" w:sz="4" w:space="0" w:color="auto"/>
+              <w:right w:val="single" w:sz="4" w:space="0" w:color="auto"/>
+            </w:tcBorders>
+            <w:shd w:val="clear" w:color="auto" w:fill="auto"/>
+            <w:noWrap/>
+            <w:vAlign w:val="bottom"/>
+            <w:hideMark/>
+          </w:tcPr>
+          <w:p>
+            <w:pPr>
+              <w:jc w:val="center"/>
+              <w:rPr>
+                <w:rFonts w:ascii="Aptos Narrow" w:hAnsi="Aptos Narrow"/>
+                <w:color w:val="000000"/>
+                <w:sz w:val="22"/>
+                <w:szCs w:val="22"/>
+              </w:rPr>
+            </w:pPr>
+            <w:r>
+              <w:rPr>
+                <w:rFonts w:ascii="Aptos Narrow" w:hAnsi="Aptos Narrow"/>
+                <w:color w:val="000000"/>
+                <w:sz w:val="22"/>
+                <w:szCs w:val="22"/>
+              </w:rPr>
+              <w:t>Elastic 2</w:t>
+            </w:r>
+          </w:p>
+        </w:tc>
+        <w:tc>
+          <w:tcPr>
+            <w:tcW w:w="1260" w:type="dxa"/>
+            <w:tcBorders>
+              <w:top w:val="nil"/>
+              <w:left w:val="nil"/>
+              <w:bottom w:val="single" w:sz="4" w:space="0" w:color="auto"/>
+              <w:right w:val="single" w:sz="4" w:space="0" w:color="auto"/>
+            </w:tcBorders>
+            <w:shd w:val="clear" w:color="auto" w:fill="auto"/>
+            <w:noWrap/>
+            <w:vAlign w:val="bottom"/>
+            <w:hideMark/>
+          </w:tcPr>
+          <w:p>
+            <w:pPr>
+              <w:jc w:val="center"/>
+              <w:rPr>
+                <w:rFonts w:ascii="Aptos Narrow" w:hAnsi="Aptos Narrow"/>
+                <w:color w:val="000000"/>
+                <w:sz w:val="22"/>
+                <w:szCs w:val="22"/>
+              </w:rPr>
+            </w:pPr>
+            <w:r>
+              <w:rPr>
+                <w:rFonts w:ascii="Aptos Narrow" w:hAnsi="Aptos Narrow"/>
+                <w:color w:val="000000"/>
+                <w:sz w:val="22"/>
+                <w:szCs w:val="22"/>
+              </w:rPr>
+              <w:t>(</w:t>
+            </w:r>
+            <w:r>
+              <w:rPr>
+                <w:rFonts w:ascii="Aptos Narrow" w:hAnsi="Aptos Narrow"/>
+                <w:color w:val="000000"/>
+                <w:sz w:val="22"/>
+                <w:szCs w:val="22"/>
+              </w:rPr>
+              <w:t>J</w:t>
+            </w:r>
+            <w:r>
+              <w:rPr>
+                <w:rFonts w:ascii="Aptos Narrow" w:hAnsi="Aptos Narrow"/>
+                <w:color w:val="000000"/>
+                <w:sz w:val="22"/>
+                <w:szCs w:val="22"/>
+              </w:rPr>
+              <w:t>)</w:t>
+            </w:r>
+          </w:p>
+        </w:tc>
+        <w:tc>
+          <w:tcPr>
+            <w:tcW w:w="2520" w:type="dxa"/>
+            <w:tcBorders>
+              <w:top w:val="nil"/>
+              <w:left w:val="nil"/>
+              <w:bottom w:val="single" w:sz="4" w:space="0" w:color="auto"/>
+              <w:right w:val="single" w:sz="4" w:space="0" w:color="auto"/>
+            </w:tcBorders>
+            <w:shd w:val="clear" w:color="auto" w:fill="auto"/>
+            <w:noWrap/>
+            <w:vAlign w:val="bottom"/>
+            <w:hideMark/>
+          </w:tcPr>
+          <w:p>
+            <w:pPr>
+              <w:jc w:val="center"/>
+              <w:rPr>
+                <w:rFonts w:ascii="Aptos Narrow" w:hAnsi="Aptos Narrow"/>
+                <w:color w:val="000000"/>
+                <w:sz w:val="22"/>
+                <w:szCs w:val="22"/>
+              </w:rPr>
+            </w:pPr>
+            <w:r>
+              <w:rPr>
+                <w:rFonts w:ascii="Aptos Narrow" w:hAnsi="Aptos Narrow"/>
+                <w:color w:val="000000"/>
+                <w:sz w:val="22"/>
+                <w:szCs w:val="22"/>
+              </w:rPr>
+              <w:t>(</w:t>
+            </w:r>
+            <m:oMath>
+              <m:r>
+                <w:rPr>
+                  <w:rFonts w:ascii="Cambria Math" w:hAnsi="Cambria Math"/>
+                  <w:color w:val="000000"/>
+                  <w:sz w:val="22"/>
+                  <w:szCs w:val="22"/>
+                </w:rPr>
+                <m:t>kg⋅</m:t>
+              </m:r>
+              <m:r>
+                <w:rPr>
+                  <w:rFonts w:ascii="Cambria Math" w:hAnsi="Cambria Math"/>
+                  <w:color w:val="000000"/>
+                  <w:sz w:val="22"/>
+                  <w:szCs w:val="22"/>
+                </w:rPr>
+                <m:t>m/</m:t>
+              </m:r>
+              <m:r>
+                <w:rPr>
+                  <w:rFonts w:ascii="Cambria Math" w:hAnsi="Cambria Math"/>
+                  <w:color w:val="000000"/>
+                  <w:sz w:val="22"/>
+                  <w:szCs w:val="22"/>
+                </w:rPr>
+                <m:t>s</m:t>
+              </m:r>
+            </m:oMath>
+            <w:r>
+              <w:rPr>
+                <w:rFonts w:ascii="Aptos Narrow" w:hAnsi="Aptos Narrow"/>
+                <w:color w:val="000000"/>
+                <w:sz w:val="22"/>
+                <w:szCs w:val="22"/>
+              </w:rPr>
+              <w:t>)</w:t>
+            </w:r>
+          </w:p>
+        </w:tc>
+        <w:tc>
+          <w:tcPr>
+            <w:tcW w:w="4050" w:type="dxa"/>
+            <w:tcBorders>
+              <w:top w:val="nil"/>
+              <w:left w:val="nil"/>
+              <w:bottom w:val="single" w:sz="4" w:space="0" w:color="auto"/>
+              <w:right w:val="single" w:sz="4" w:space="0" w:color="auto"/>
+            </w:tcBorders>
+            <w:shd w:val="clear" w:color="auto" w:fill="auto"/>
+            <w:noWrap/>
+            <w:vAlign w:val="bottom"/>
+            <w:hideMark/>
+          </w:tcPr>
+          <w:p>
+            <w:pPr>
+              <w:jc w:val="center"/>
+              <w:rPr>
+                <w:rFonts w:ascii="Aptos Narrow" w:hAnsi="Aptos Narrow"/>
+                <w:color w:val="000000"/>
+                <w:sz w:val="22"/>
+                <w:szCs w:val="22"/>
+              </w:rPr>
+            </w:pPr>
+            <w:r>
+              <w:rPr>
+                <w:rFonts w:ascii="Aptos Narrow" w:hAnsi="Aptos Narrow"/>
+                <w:color w:val="000000"/>
+                <w:sz w:val="22"/>
+                <w:szCs w:val="22"/>
+              </w:rPr>
+              <w:t>(%)</w:t>
+            </w:r>
+          </w:p>
+        </w:tc>
+      </w:tr>
+      <w:tr>
+        <w:trPr>
+          <w:trHeight w:val="288"/>
+        </w:trPr>
+        <w:tc>
+          <w:tcPr>
+            <w:tcW w:w="1075" w:type="dxa"/>
+            <w:tcBorders>
+              <w:top w:val="nil"/>
+              <w:left w:val="single" w:sz="4" w:space="0" w:color="auto"/>
+              <w:bottom w:val="single" w:sz="4" w:space="0" w:color="auto"/>
+              <w:right w:val="single" w:sz="4" w:space="0" w:color="auto"/>
+            </w:tcBorders>
+            <w:shd w:val="clear" w:color="auto" w:fill="auto"/>
+            <w:noWrap/>
+            <w:vAlign w:val="bottom"/>
+            <w:hideMark/>
+          </w:tcPr>
+          <w:p>
+            <w:pPr>
+              <w:jc w:val="center"/>
+              <w:rPr>
+                <w:rFonts w:ascii="Aptos Narrow" w:hAnsi="Aptos Narrow"/>
+                <w:color w:val="000000"/>
+                <w:sz w:val="22"/>
+                <w:szCs w:val="22"/>
+              </w:rPr>
+            </w:pPr>
+            <w:r>
+              <w:rPr>
+                <w:rFonts w:ascii="Aptos Narrow" w:hAnsi="Aptos Narrow"/>
+                <w:color w:val="000000"/>
+                <w:sz w:val="22"/>
+                <w:szCs w:val="22"/>
+              </w:rPr>
+              <w:t>1</w:t>
+            </w:r>
+          </w:p>
+        </w:tc>
+        <w:tc>
+          <w:tcPr>
+            <w:tcW w:w="1260" w:type="dxa"/>
+            <w:tcBorders>
+              <w:top w:val="nil"/>
+              <w:left w:val="nil"/>
+              <w:bottom w:val="single" w:sz="4" w:space="0" w:color="auto"/>
+              <w:right w:val="single" w:sz="4" w:space="0" w:color="auto"/>
+            </w:tcBorders>
+            <w:shd w:val="clear" w:color="auto" w:fill="auto"/>
+            <w:noWrap/>
+            <w:vAlign w:val="bottom"/>
+            <w:hideMark/>
+          </w:tcPr>
+          <w:p>
+            <w:pPr>
+              <w:jc w:val="center"/>
+              <w:rPr>
+                <w:rFonts w:ascii="Aptos Narrow" w:hAnsi="Aptos Narrow"/>
+                <w:color w:val="000000"/>
+                <w:sz w:val="22"/>
+                <w:szCs w:val="22"/>
+              </w:rPr>
+            </w:pPr>
+          </w:p>
+        </w:tc>
+        <w:tc>
+          <w:tcPr>
+            <w:tcW w:w="2520" w:type="dxa"/>
+            <w:tcBorders>
+              <w:top w:val="nil"/>
+              <w:left w:val="nil"/>
+              <w:bottom w:val="single" w:sz="4" w:space="0" w:color="auto"/>
+              <w:right w:val="single" w:sz="4" w:space="0" w:color="auto"/>
+            </w:tcBorders>
+            <w:shd w:val="clear" w:color="auto" w:fill="auto"/>
+            <w:noWrap/>
+            <w:vAlign w:val="bottom"/>
+            <w:hideMark/>
+          </w:tcPr>
+          <w:p>
+            <w:pPr>
+              <w:jc w:val="center"/>
+              <w:rPr>
+                <w:rFonts w:ascii="Aptos Narrow" w:hAnsi="Aptos Narrow"/>
+                <w:color w:val="000000"/>
+                <w:sz w:val="22"/>
+                <w:szCs w:val="22"/>
+              </w:rPr>
+            </w:pPr>
+          </w:p>
+        </w:tc>
+        <w:tc>
+          <w:tcPr>
+            <w:tcW w:w="4050" w:type="dxa"/>
+            <w:tcBorders>
+              <w:top w:val="nil"/>
+              <w:left w:val="nil"/>
+              <w:bottom w:val="single" w:sz="4" w:space="0" w:color="auto"/>
+              <w:right w:val="single" w:sz="4" w:space="0" w:color="auto"/>
+            </w:tcBorders>
+            <w:shd w:val="clear" w:color="auto" w:fill="auto"/>
+            <w:noWrap/>
+            <w:vAlign w:val="bottom"/>
+            <w:hideMark/>
+          </w:tcPr>
+          <w:p>
+            <w:pPr>
+              <w:jc w:val="center"/>
+              <w:rPr>
+                <w:rFonts w:ascii="Aptos Narrow" w:hAnsi="Aptos Narrow"/>
+                <w:color w:val="000000"/>
+                <w:sz w:val="22"/>
+                <w:szCs w:val="22"/>
+              </w:rPr>
+            </w:pPr>
+          </w:p>
+        </w:tc>
+      </w:tr>
+      <w:tr>
+        <w:trPr>
+          <w:trHeight w:val="288"/>
+        </w:trPr>
+        <w:tc>
+          <w:tcPr>
+            <w:tcW w:w="1075" w:type="dxa"/>
+            <w:tcBorders>
+              <w:top w:val="nil"/>
+              <w:left w:val="single" w:sz="4" w:space="0" w:color="auto"/>
+              <w:bottom w:val="single" w:sz="4" w:space="0" w:color="auto"/>
+              <w:right w:val="single" w:sz="4" w:space="0" w:color="auto"/>
+            </w:tcBorders>
+            <w:shd w:val="clear" w:color="auto" w:fill="auto"/>
+            <w:noWrap/>
+            <w:vAlign w:val="bottom"/>
+            <w:hideMark/>
+          </w:tcPr>
+          <w:p>
+            <w:pPr>
+              <w:jc w:val="center"/>
+              <w:rPr>
+                <w:rFonts w:ascii="Aptos Narrow" w:hAnsi="Aptos Narrow"/>
+                <w:color w:val="000000"/>
+                <w:sz w:val="22"/>
+                <w:szCs w:val="22"/>
+              </w:rPr>
+            </w:pPr>
+            <w:r>
+              <w:rPr>
+                <w:rFonts w:ascii="Aptos Narrow" w:hAnsi="Aptos Narrow"/>
+                <w:color w:val="000000"/>
+                <w:sz w:val="22"/>
+                <w:szCs w:val="22"/>
+              </w:rPr>
+              <w:t>2</w:t>
+            </w:r>
+          </w:p>
+        </w:tc>
+        <w:tc>
+          <w:tcPr>
+            <w:tcW w:w="1260" w:type="dxa"/>
+            <w:tcBorders>
+              <w:top w:val="nil"/>
+              <w:left w:val="nil"/>
+              <w:bottom w:val="single" w:sz="4" w:space="0" w:color="auto"/>
+              <w:right w:val="single" w:sz="4" w:space="0" w:color="auto"/>
+            </w:tcBorders>
+            <w:shd w:val="clear" w:color="auto" w:fill="auto"/>
+            <w:noWrap/>
+            <w:vAlign w:val="bottom"/>
+            <w:hideMark/>
+          </w:tcPr>
+          <w:p>
+            <w:pPr>
+              <w:jc w:val="center"/>
+              <w:rPr>
+                <w:rFonts w:ascii="Aptos Narrow" w:hAnsi="Aptos Narrow"/>
+                <w:color w:val="000000"/>
+                <w:sz w:val="22"/>
+                <w:szCs w:val="22"/>
+              </w:rPr>
+            </w:pPr>
+          </w:p>
+        </w:tc>
+        <w:tc>
+          <w:tcPr>
+            <w:tcW w:w="2520" w:type="dxa"/>
+            <w:tcBorders>
+              <w:top w:val="nil"/>
+              <w:left w:val="nil"/>
+              <w:bottom w:val="single" w:sz="4" w:space="0" w:color="auto"/>
+              <w:right w:val="single" w:sz="4" w:space="0" w:color="auto"/>
+            </w:tcBorders>
+            <w:shd w:val="clear" w:color="auto" w:fill="auto"/>
+            <w:noWrap/>
+            <w:vAlign w:val="bottom"/>
+            <w:hideMark/>
+          </w:tcPr>
+          <w:p>
+            <w:pPr>
+              <w:jc w:val="center"/>
+              <w:rPr>
+                <w:rFonts w:ascii="Aptos Narrow" w:hAnsi="Aptos Narrow"/>
+                <w:color w:val="000000"/>
+                <w:sz w:val="22"/>
+                <w:szCs w:val="22"/>
+              </w:rPr>
+            </w:pPr>
+          </w:p>
+        </w:tc>
+        <w:tc>
+          <w:tcPr>
+            <w:tcW w:w="4050" w:type="dxa"/>
+            <w:tcBorders>
+              <w:top w:val="nil"/>
+              <w:left w:val="nil"/>
+              <w:bottom w:val="single" w:sz="4" w:space="0" w:color="auto"/>
+              <w:right w:val="single" w:sz="4" w:space="0" w:color="auto"/>
+            </w:tcBorders>
+            <w:shd w:val="clear" w:color="auto" w:fill="auto"/>
+            <w:noWrap/>
+            <w:vAlign w:val="bottom"/>
+            <w:hideMark/>
+          </w:tcPr>
+          <w:p>
+            <w:pPr>
+              <w:jc w:val="center"/>
+              <w:rPr>
+                <w:rFonts w:ascii="Aptos Narrow" w:hAnsi="Aptos Narrow"/>
+                <w:color w:val="000000"/>
+                <w:sz w:val="22"/>
+                <w:szCs w:val="22"/>
+              </w:rPr>
+            </w:pPr>
+          </w:p>
+        </w:tc>
+      </w:tr>
+    </w:tbl>
+    <w:p>
+      <w:pPr>
+        <w:keepNext/>
+      </w:pPr>
+    </w:p>
+    <w:p>
+      <w:pPr>
+        <w:pStyle w:val="NormalWeb"/>
+        <w:numPr>
+          <w:ilvl w:val="0"/>
+          <w:numId w:val="4"/>
+        </w:numPr>
+        <w:spacing w:before="200" w:beforeAutospacing="0" w:after="0" w:afterAutospacing="0"/>
+        <w:rPr>
+          <w:rFonts w:eastAsiaTheme="minorEastAsia"/>
+          <w:color w:val="404040" w:themeColor="text1" w:themeTint="BF"/>
+          <w:kern w:val="24"/>
+        </w:rPr>
+      </w:pPr>
+      <w:r>
+        <w:rPr>
+          <w:rFonts w:eastAsiaTheme="minorEastAsia"/>
+          <w:color w:val="404040" w:themeColor="text1" w:themeTint="BF"/>
+          <w:kern w:val="24"/>
+        </w:rPr>
+        <w:t>If the impulse-momentum theorem is correct, the change in momentum will equal the impulse for each trial. Experimental measurement errors, along with friction and shifting of the track or Force Sensor, will keep the two from being exactly the same. One way to compare the two is to find their percentage difference using:</w:t>
       </w:r>
     </w:p>
     <w:p>
       <w:pPr>
         <w:pStyle w:val="NormalWeb"/>
         <w:spacing w:before="200" w:beforeAutospacing="0" w:after="0" w:afterAutospacing="0"/>
-        <w:rPr>
-          <w:rFonts w:eastAsiaTheme="minorEastAsia"/>
-          <w:color w:val="404040" w:themeColor="text1" w:themeTint="BF"/>
-          <w:kern w:val="24"/>
-        </w:rPr>
-      </w:pPr>
-      <w:r>
-        <w:rPr>
-          <w:rFonts w:eastAsiaTheme="minorEastAsia"/>
-          <w:color w:val="404040" w:themeColor="text1" w:themeTint="BF"/>
-          <w:kern w:val="24"/>
-        </w:rPr>
-        <w:t>3.</w:t>
-      </w:r>
-      <w:r>
-        <w:rPr>
-          <w:rFonts w:eastAsiaTheme="minorEastAsia"/>
-          <w:color w:val="404040" w:themeColor="text1" w:themeTint="BF"/>
-          <w:kern w:val="24"/>
-        </w:rPr>
-        <w:tab/>
-        <w:t>If the impulse-momentum theorem is correct, the change in momentum will equal the impulse for each trial. Experimental measurement errors, along with friction and shifting of the track or Force Sensor, will keep the two from being exactly the same. One way to compare the two is to find their percentage difference using:</w:t>
-      </w:r>
+        <w:ind w:left="720"/>
+        <w:rPr>
+          <w:rFonts w:eastAsiaTheme="minorEastAsia"/>
+          <w:color w:val="404040" w:themeColor="text1" w:themeTint="BF"/>
+          <w:kern w:val="24"/>
+        </w:rPr>
+      </w:pPr>
+      <m:oMathPara>
+        <m:oMath>
+          <m:r>
+            <w:rPr>
+              <w:rFonts w:ascii="Cambria Math" w:eastAsiaTheme="minorEastAsia" w:hAnsi="Cambria Math"/>
+              <w:color w:val="404040" w:themeColor="text1" w:themeTint="BF"/>
+              <w:kern w:val="24"/>
+            </w:rPr>
+            <m:t xml:space="preserve">%difference= </m:t>
+          </m:r>
+          <m:f>
+            <m:fPr>
+              <m:ctrlPr>
+                <w:rPr>
+                  <w:rFonts w:ascii="Cambria Math" w:eastAsiaTheme="minorEastAsia" w:hAnsi="Cambria Math"/>
+                  <w:i/>
+                  <w:color w:val="404040" w:themeColor="text1" w:themeTint="BF"/>
+                  <w:kern w:val="24"/>
+                </w:rPr>
+              </m:ctrlPr>
+            </m:fPr>
+            <m:num>
+              <m:d>
+                <m:dPr>
+                  <m:begChr m:val="|"/>
+                  <m:endChr m:val="|"/>
+                  <m:ctrlPr>
+                    <w:rPr>
+                      <w:rFonts w:ascii="Cambria Math" w:eastAsiaTheme="minorEastAsia" w:hAnsi="Cambria Math"/>
+                      <w:i/>
+                      <w:color w:val="404040" w:themeColor="text1" w:themeTint="BF"/>
+                      <w:kern w:val="24"/>
+                    </w:rPr>
+                  </m:ctrlPr>
+                </m:dPr>
+                <m:e>
+                  <m:sSub>
+                    <m:sSubPr>
+                      <m:ctrlPr>
+                        <w:rPr>
+                          <w:rFonts w:ascii="Cambria Math" w:eastAsiaTheme="minorEastAsia" w:hAnsi="Cambria Math"/>
+                          <w:i/>
+                          <w:color w:val="404040" w:themeColor="text1" w:themeTint="BF"/>
+                          <w:kern w:val="24"/>
+                        </w:rPr>
+                      </m:ctrlPr>
+                    </m:sSubPr>
+                    <m:e>
+                      <m:r>
+                        <w:rPr>
+                          <w:rFonts w:ascii="Cambria Math" w:eastAsiaTheme="minorEastAsia" w:hAnsi="Cambria Math"/>
+                          <w:color w:val="404040" w:themeColor="text1" w:themeTint="BF"/>
+                          <w:kern w:val="24"/>
+                        </w:rPr>
+                        <m:t>x</m:t>
+                      </m:r>
+                    </m:e>
+                    <m:sub>
+                      <m:r>
+                        <w:rPr>
+                          <w:rFonts w:ascii="Cambria Math" w:eastAsiaTheme="minorEastAsia" w:hAnsi="Cambria Math"/>
+                          <w:color w:val="404040" w:themeColor="text1" w:themeTint="BF"/>
+                          <w:kern w:val="24"/>
+                        </w:rPr>
+                        <m:t>1</m:t>
+                      </m:r>
+                    </m:sub>
+                  </m:sSub>
+                  <m:r>
+                    <w:rPr>
+                      <w:rFonts w:ascii="Cambria Math" w:eastAsiaTheme="minorEastAsia" w:hAnsi="Cambria Math"/>
+                      <w:color w:val="404040" w:themeColor="text1" w:themeTint="BF"/>
+                      <w:kern w:val="24"/>
+                    </w:rPr>
+                    <m:t>-</m:t>
+                  </m:r>
+                  <m:sSub>
+                    <m:sSubPr>
+                      <m:ctrlPr>
+                        <w:rPr>
+                          <w:rFonts w:ascii="Cambria Math" w:eastAsiaTheme="minorEastAsia" w:hAnsi="Cambria Math"/>
+                          <w:i/>
+                          <w:color w:val="404040" w:themeColor="text1" w:themeTint="BF"/>
+                          <w:kern w:val="24"/>
+                        </w:rPr>
+                      </m:ctrlPr>
+                    </m:sSubPr>
+                    <m:e>
+                      <m:r>
+                        <w:rPr>
+                          <w:rFonts w:ascii="Cambria Math" w:eastAsiaTheme="minorEastAsia" w:hAnsi="Cambria Math"/>
+                          <w:color w:val="404040" w:themeColor="text1" w:themeTint="BF"/>
+                          <w:kern w:val="24"/>
+                        </w:rPr>
+                        <m:t>x</m:t>
+                      </m:r>
+                    </m:e>
+                    <m:sub>
+                      <m:r>
+                        <w:rPr>
+                          <w:rFonts w:ascii="Cambria Math" w:eastAsiaTheme="minorEastAsia" w:hAnsi="Cambria Math"/>
+                          <w:color w:val="404040" w:themeColor="text1" w:themeTint="BF"/>
+                          <w:kern w:val="24"/>
+                        </w:rPr>
+                        <m:t>2</m:t>
+                      </m:r>
+                    </m:sub>
+                  </m:sSub>
+                </m:e>
+              </m:d>
+            </m:num>
+            <m:den>
+              <m:r>
+                <w:rPr>
+                  <w:rFonts w:ascii="Cambria Math" w:eastAsiaTheme="minorEastAsia" w:hAnsi="Cambria Math"/>
+                  <w:color w:val="404040" w:themeColor="text1" w:themeTint="BF"/>
+                  <w:kern w:val="24"/>
+                </w:rPr>
+                <m:t>0.5(</m:t>
+              </m:r>
+              <m:sSub>
+                <m:sSubPr>
+                  <m:ctrlPr>
+                    <w:rPr>
+                      <w:rFonts w:ascii="Cambria Math" w:eastAsiaTheme="minorEastAsia" w:hAnsi="Cambria Math"/>
+                      <w:i/>
+                      <w:color w:val="404040" w:themeColor="text1" w:themeTint="BF"/>
+                      <w:kern w:val="24"/>
+                    </w:rPr>
+                  </m:ctrlPr>
+                </m:sSubPr>
+                <m:e>
+                  <m:r>
+                    <w:rPr>
+                      <w:rFonts w:ascii="Cambria Math" w:eastAsiaTheme="minorEastAsia" w:hAnsi="Cambria Math"/>
+                      <w:color w:val="404040" w:themeColor="text1" w:themeTint="BF"/>
+                      <w:kern w:val="24"/>
+                    </w:rPr>
+                    <m:t>x</m:t>
+                  </m:r>
+                </m:e>
+                <m:sub>
+                  <m:r>
+                    <w:rPr>
+                      <w:rFonts w:ascii="Cambria Math" w:eastAsiaTheme="minorEastAsia" w:hAnsi="Cambria Math"/>
+                      <w:color w:val="404040" w:themeColor="text1" w:themeTint="BF"/>
+                      <w:kern w:val="24"/>
+                    </w:rPr>
+                    <m:t>1</m:t>
+                  </m:r>
+                </m:sub>
+              </m:sSub>
+              <m:r>
+                <w:rPr>
+                  <w:rFonts w:ascii="Cambria Math" w:eastAsiaTheme="minorEastAsia" w:hAnsi="Cambria Math"/>
+                  <w:color w:val="404040" w:themeColor="text1" w:themeTint="BF"/>
+                  <w:kern w:val="24"/>
+                </w:rPr>
+                <m:t>+</m:t>
+              </m:r>
+              <m:sSub>
+                <m:sSubPr>
+                  <m:ctrlPr>
+                    <w:rPr>
+                      <w:rFonts w:ascii="Cambria Math" w:eastAsiaTheme="minorEastAsia" w:hAnsi="Cambria Math"/>
+                      <w:i/>
+                      <w:color w:val="404040" w:themeColor="text1" w:themeTint="BF"/>
+                      <w:kern w:val="24"/>
+                    </w:rPr>
+                  </m:ctrlPr>
+                </m:sSubPr>
+                <m:e>
+                  <m:r>
+                    <w:rPr>
+                      <w:rFonts w:ascii="Cambria Math" w:eastAsiaTheme="minorEastAsia" w:hAnsi="Cambria Math"/>
+                      <w:color w:val="404040" w:themeColor="text1" w:themeTint="BF"/>
+                      <w:kern w:val="24"/>
+                    </w:rPr>
+                    <m:t>x</m:t>
+                  </m:r>
+                </m:e>
+                <m:sub>
+                  <m:r>
+                    <w:rPr>
+                      <w:rFonts w:ascii="Cambria Math" w:eastAsiaTheme="minorEastAsia" w:hAnsi="Cambria Math"/>
+                      <w:color w:val="404040" w:themeColor="text1" w:themeTint="BF"/>
+                      <w:kern w:val="24"/>
+                    </w:rPr>
+                    <m:t>2</m:t>
+                  </m:r>
+                </m:sub>
+              </m:sSub>
+              <m:r>
+                <w:rPr>
+                  <w:rFonts w:ascii="Cambria Math" w:eastAsiaTheme="minorEastAsia" w:hAnsi="Cambria Math"/>
+                  <w:color w:val="404040" w:themeColor="text1" w:themeTint="BF"/>
+                  <w:kern w:val="24"/>
+                </w:rPr>
+                <m:t>)</m:t>
+              </m:r>
+            </m:den>
+          </m:f>
+          <m:r>
+            <w:rPr>
+              <w:rFonts w:ascii="Cambria Math" w:eastAsiaTheme="minorEastAsia" w:hAnsi="Cambria Math"/>
+              <w:color w:val="404040" w:themeColor="text1" w:themeTint="BF"/>
+              <w:kern w:val="24"/>
+            </w:rPr>
+            <m:t>×100</m:t>
+          </m:r>
+        </m:oMath>
+      </m:oMathPara>
     </w:p>
     <w:p>
       <w:pPr>
         <w:pStyle w:val="NormalWeb"/>
         <w:spacing w:before="200" w:beforeAutospacing="0" w:after="0" w:afterAutospacing="0"/>
-        <w:jc w:val="center"/>
-        <w:rPr>
-          <w:sz w:val="16"/>
-          <w:szCs w:val="16"/>
-        </w:rPr>
-      </w:pPr>
-      <w:r>
-        <w:rPr>
-          <w:noProof/>
-          <w14:ligatures w14:val="standardContextual"/>
-        </w:rPr>
-        <w:drawing>
-          <wp:inline distT="0" distB="0" distL="0" distR="0" wp14:anchorId="7F0E6FCE" wp14:editId="0C21ECBF">
-            <wp:extent cx="1996440" cy="450810"/>
-            <wp:effectExtent l="0" t="0" r="3810" b="6985"/>
-            <wp:docPr id="5" name="Picture 4" descr="A mathematical expression showing the change in a variable, represented as delta t, with the Greek letter delta followed by the letter t.">
-              <a:extLst xmlns:a="http://schemas.openxmlformats.org/drawingml/2006/main">
-                <a:ext uri="{FF2B5EF4-FFF2-40B4-BE49-F238E27FC236}">
-                  <a16:creationId xmlns:a16="http://schemas.microsoft.com/office/drawing/2014/main" id="{22E41548-8347-F651-70C7-4E2D1D1CA446}"/>
-                </a:ext>
-              </a:extLst>
-            </wp:docPr>
-            <wp:cNvGraphicFramePr>
-              <a:graphicFrameLocks xmlns:a="http://schemas.openxmlformats.org/drawingml/2006/main" noChangeAspect="1"/>
-            </wp:cNvGraphicFramePr>
-            <a:graphic xmlns:a="http://schemas.openxmlformats.org/drawingml/2006/main">
-              <a:graphicData uri="http://schemas.openxmlformats.org/drawingml/2006/picture">
-                <pic:pic xmlns:pic="http://schemas.openxmlformats.org/drawingml/2006/picture">
-                  <pic:nvPicPr>
-                    <pic:cNvPr id="5" name="Picture 4">
-                      <a:extLst>
-                        <a:ext uri="{FF2B5EF4-FFF2-40B4-BE49-F238E27FC236}">
-                          <a16:creationId xmlns:a16="http://schemas.microsoft.com/office/drawing/2014/main" id="{22E41548-8347-F651-70C7-4E2D1D1CA446}"/>
-                        </a:ext>
-                      </a:extLst>
-                    </pic:cNvPr>
-                    <pic:cNvPicPr>
-                      <a:picLocks noChangeAspect="1"/>
-                    </pic:cNvPicPr>
-                  </pic:nvPicPr>
-                  <pic:blipFill>
-                    <a:blip r:embed="rId7"/>
-                    <a:stretch>
-                      <a:fillRect/>
-                    </a:stretch>
-                  </pic:blipFill>
-                  <pic:spPr>
-                    <a:xfrm>
-                      <a:off x="0" y="0"/>
-                      <a:ext cx="2021583" cy="456488"/>
-                    </a:xfrm>
-                    <a:prstGeom prst="rect">
-                      <a:avLst/>
-                    </a:prstGeom>
-                  </pic:spPr>
-                </pic:pic>
-              </a:graphicData>
-            </a:graphic>
-          </wp:inline>
-        </w:drawing>
-      </w:r>
-    </w:p>
-    <w:p>
-      <w:pPr>
-        <w:pStyle w:val="NormalWeb"/>
-        <w:spacing w:before="200" w:beforeAutospacing="0" w:after="0" w:afterAutospacing="0"/>
-        <w:rPr>
-          <w:sz w:val="16"/>
-          <w:szCs w:val="16"/>
-        </w:rPr>
-      </w:pPr>
-      <w:r>
-        <w:rPr>
-          <w:rFonts w:eastAsiaTheme="minorEastAsia"/>
-          <w:color w:val="404040" w:themeColor="text1" w:themeTint="BF"/>
-          <w:kern w:val="24"/>
-        </w:rPr>
-        <w:t xml:space="preserve">Where </w:t>
+        <w:rPr>
+          <w:rFonts w:eastAsiaTheme="minorEastAsia"/>
+          <w:color w:val="404040" w:themeColor="text1" w:themeTint="BF"/>
+          <w:kern w:val="24"/>
+        </w:rPr>
+      </w:pPr>
+      <w:r>
+        <w:rPr>
+          <w:rFonts w:eastAsiaTheme="minorEastAsia"/>
+          <w:color w:val="404040" w:themeColor="text1" w:themeTint="BF"/>
+          <w:kern w:val="24"/>
+        </w:rPr>
+        <w:t>Where</w:t>
+      </w:r>
+      <w:r>
+        <w:rPr>
+          <w:rFonts w:eastAsiaTheme="minorEastAsia"/>
+          <w:color w:val="404040" w:themeColor="text1" w:themeTint="BF"/>
+          <w:kern w:val="24"/>
+        </w:rPr>
+        <w:t>:</w:t>
+      </w:r>
+      <w:r>
+        <w:rPr>
+          <w:rFonts w:eastAsiaTheme="minorEastAsia"/>
+          <w:color w:val="404040" w:themeColor="text1" w:themeTint="BF"/>
+          <w:kern w:val="24"/>
+        </w:rPr>
+        <w:br/>
       </w:r>
       <m:oMath>
         <m:sSub>
@@ -1971,7 +4055,7 @@
             <w:color w:val="404040" w:themeColor="text1" w:themeTint="BF"/>
             <w:kern w:val="24"/>
           </w:rPr>
-          <m:t>Δt </m:t>
+          <m:t>Δt</m:t>
         </m:r>
       </m:oMath>
       <w:r>
@@ -1980,7 +4064,15 @@
           <w:color w:val="404040" w:themeColor="text1" w:themeTint="BF"/>
           <w:kern w:val="24"/>
         </w:rPr>
-        <w:t xml:space="preserve">and </w:t>
+        <w:t xml:space="preserve"> </w:t>
+      </w:r>
+      <w:r>
+        <w:rPr>
+          <w:rFonts w:eastAsiaTheme="minorEastAsia"/>
+          <w:color w:val="404040" w:themeColor="text1" w:themeTint="BF"/>
+          <w:kern w:val="24"/>
+        </w:rPr>
+        <w:br/>
       </w:r>
       <m:oMath>
         <m:sSub>
@@ -2140,62 +4232,1035 @@
     <w:p>
       <w:pPr>
         <w:pStyle w:val="NormalWeb"/>
-        <w:numPr>
-          <w:ilvl w:val="0"/>
-          <w:numId w:val="2"/>
-        </w:numPr>
         <w:spacing w:before="200" w:beforeAutospacing="0" w:after="0" w:afterAutospacing="0"/>
-        <w:rPr>
-          <w:rFonts w:eastAsiaTheme="minorEastAsia"/>
-          <w:color w:val="404040" w:themeColor="text1" w:themeTint="BF"/>
-          <w:kern w:val="24"/>
-        </w:rPr>
-      </w:pPr>
-      <w:r>
-        <w:rPr>
-          <w:rFonts w:eastAsiaTheme="minorEastAsia"/>
-          <w:color w:val="404040" w:themeColor="text1" w:themeTint="BF"/>
-          <w:kern w:val="24"/>
-        </w:rPr>
-        <w:tab/>
-        <w:t>Do</w:t>
-      </w:r>
-      <w:r>
-        <w:rPr>
-          <w:rFonts w:eastAsiaTheme="minorEastAsia"/>
-          <w:color w:val="404040" w:themeColor="text1" w:themeTint="BF"/>
-          <w:kern w:val="24"/>
-        </w:rPr>
-        <w:t>es</w:t>
-      </w:r>
-      <w:r>
-        <w:rPr>
-          <w:rFonts w:eastAsiaTheme="minorEastAsia"/>
-          <w:color w:val="404040" w:themeColor="text1" w:themeTint="BF"/>
-          <w:kern w:val="24"/>
-        </w:rPr>
-        <w:t xml:space="preserve"> your data support the impulse-momentum theorem? Explain.</w:t>
+        <w:ind w:left="720"/>
+        <w:rPr>
+          <w:rFonts w:eastAsiaTheme="minorEastAsia"/>
+          <w:color w:val="404040" w:themeColor="text1" w:themeTint="BF"/>
+          <w:kern w:val="24"/>
+        </w:rPr>
+      </w:pPr>
+      <w:r>
+        <w:rPr>
+          <w:rFonts w:eastAsiaTheme="minorEastAsia"/>
+          <w:color w:val="404040" w:themeColor="text1" w:themeTint="BF"/>
+          <w:kern w:val="24"/>
+        </w:rPr>
+        <w:t>Elastic 1:</w:t>
       </w:r>
     </w:p>
     <w:p>
       <w:pPr>
         <w:pStyle w:val="NormalWeb"/>
         <w:spacing w:before="200" w:beforeAutospacing="0" w:after="0" w:afterAutospacing="0"/>
-        <w:rPr>
-          <w:sz w:val="16"/>
-          <w:szCs w:val="16"/>
-        </w:rPr>
-      </w:pPr>
+        <w:ind w:left="720"/>
+        <w:rPr>
+          <w:rFonts w:eastAsiaTheme="minorEastAsia"/>
+          <w:color w:val="404040" w:themeColor="text1" w:themeTint="BF"/>
+          <w:kern w:val="24"/>
+        </w:rPr>
+      </w:pPr>
+      <w:r>
+        <w:rPr>
+          <w:rFonts w:eastAsiaTheme="minorEastAsia"/>
+          <w:color w:val="404040" w:themeColor="text1" w:themeTint="BF"/>
+          <w:kern w:val="24"/>
+        </w:rPr>
+        <w:tab/>
+        <w:t xml:space="preserve">1. </w:t>
+      </w:r>
+      <m:oMath>
+        <m:f>
+          <m:fPr>
+            <m:ctrlPr>
+              <w:rPr>
+                <w:rFonts w:ascii="Cambria Math" w:eastAsiaTheme="minorEastAsia" w:hAnsi="Cambria Math"/>
+                <w:i/>
+                <w:color w:val="404040" w:themeColor="text1" w:themeTint="BF"/>
+                <w:kern w:val="24"/>
+              </w:rPr>
+            </m:ctrlPr>
+          </m:fPr>
+          <m:num>
+            <m:d>
+              <m:dPr>
+                <m:begChr m:val="|"/>
+                <m:endChr m:val="|"/>
+                <m:ctrlPr>
+                  <w:rPr>
+                    <w:rFonts w:ascii="Cambria Math" w:eastAsiaTheme="minorEastAsia" w:hAnsi="Cambria Math"/>
+                    <w:i/>
+                    <w:color w:val="404040" w:themeColor="text1" w:themeTint="BF"/>
+                    <w:kern w:val="24"/>
+                  </w:rPr>
+                </m:ctrlPr>
+              </m:dPr>
+              <m:e>
+                <m:sSub>
+                  <m:sSubPr>
+                    <m:ctrlPr>
+                      <w:rPr>
+                        <w:rFonts w:ascii="Cambria Math" w:eastAsiaTheme="minorEastAsia" w:hAnsi="Cambria Math"/>
+                        <w:i/>
+                        <w:color w:val="404040" w:themeColor="text1" w:themeTint="BF"/>
+                        <w:kern w:val="24"/>
+                      </w:rPr>
+                    </m:ctrlPr>
+                  </m:sSubPr>
+                  <m:e>
+                    <m:r>
+                      <w:rPr>
+                        <w:rFonts w:ascii="Cambria Math" w:eastAsiaTheme="minorEastAsia" w:hAnsi="Cambria Math"/>
+                        <w:color w:val="404040" w:themeColor="text1" w:themeTint="BF"/>
+                        <w:kern w:val="24"/>
+                      </w:rPr>
+                      <m:t>x</m:t>
+                    </m:r>
+                  </m:e>
+                  <m:sub>
+                    <m:r>
+                      <w:rPr>
+                        <w:rFonts w:ascii="Cambria Math" w:eastAsiaTheme="minorEastAsia" w:hAnsi="Cambria Math"/>
+                        <w:color w:val="404040" w:themeColor="text1" w:themeTint="BF"/>
+                        <w:kern w:val="24"/>
+                      </w:rPr>
+                      <m:t>1</m:t>
+                    </m:r>
+                  </m:sub>
+                </m:sSub>
+                <m:r>
+                  <w:rPr>
+                    <w:rFonts w:ascii="Cambria Math" w:eastAsiaTheme="minorEastAsia" w:hAnsi="Cambria Math"/>
+                    <w:color w:val="404040" w:themeColor="text1" w:themeTint="BF"/>
+                    <w:kern w:val="24"/>
+                  </w:rPr>
+                  <m:t>-</m:t>
+                </m:r>
+                <m:sSub>
+                  <m:sSubPr>
+                    <m:ctrlPr>
+                      <w:rPr>
+                        <w:rFonts w:ascii="Cambria Math" w:eastAsiaTheme="minorEastAsia" w:hAnsi="Cambria Math"/>
+                        <w:i/>
+                        <w:color w:val="404040" w:themeColor="text1" w:themeTint="BF"/>
+                        <w:kern w:val="24"/>
+                      </w:rPr>
+                    </m:ctrlPr>
+                  </m:sSubPr>
+                  <m:e>
+                    <m:r>
+                      <w:rPr>
+                        <w:rFonts w:ascii="Cambria Math" w:eastAsiaTheme="minorEastAsia" w:hAnsi="Cambria Math"/>
+                        <w:color w:val="404040" w:themeColor="text1" w:themeTint="BF"/>
+                        <w:kern w:val="24"/>
+                      </w:rPr>
+                      <m:t>x</m:t>
+                    </m:r>
+                  </m:e>
+                  <m:sub>
+                    <m:r>
+                      <w:rPr>
+                        <w:rFonts w:ascii="Cambria Math" w:eastAsiaTheme="minorEastAsia" w:hAnsi="Cambria Math"/>
+                        <w:color w:val="404040" w:themeColor="text1" w:themeTint="BF"/>
+                        <w:kern w:val="24"/>
+                      </w:rPr>
+                      <m:t>2</m:t>
+                    </m:r>
+                  </m:sub>
+                </m:sSub>
+              </m:e>
+            </m:d>
+          </m:num>
+          <m:den>
+            <m:r>
+              <w:rPr>
+                <w:rFonts w:ascii="Cambria Math" w:eastAsiaTheme="minorEastAsia" w:hAnsi="Cambria Math"/>
+                <w:color w:val="404040" w:themeColor="text1" w:themeTint="BF"/>
+                <w:kern w:val="24"/>
+              </w:rPr>
+              <m:t>0.5(</m:t>
+            </m:r>
+            <m:sSub>
+              <m:sSubPr>
+                <m:ctrlPr>
+                  <w:rPr>
+                    <w:rFonts w:ascii="Cambria Math" w:eastAsiaTheme="minorEastAsia" w:hAnsi="Cambria Math"/>
+                    <w:i/>
+                    <w:color w:val="404040" w:themeColor="text1" w:themeTint="BF"/>
+                    <w:kern w:val="24"/>
+                  </w:rPr>
+                </m:ctrlPr>
+              </m:sSubPr>
+              <m:e>
+                <m:r>
+                  <w:rPr>
+                    <w:rFonts w:ascii="Cambria Math" w:eastAsiaTheme="minorEastAsia" w:hAnsi="Cambria Math"/>
+                    <w:color w:val="404040" w:themeColor="text1" w:themeTint="BF"/>
+                    <w:kern w:val="24"/>
+                  </w:rPr>
+                  <m:t>x</m:t>
+                </m:r>
+              </m:e>
+              <m:sub>
+                <m:r>
+                  <w:rPr>
+                    <w:rFonts w:ascii="Cambria Math" w:eastAsiaTheme="minorEastAsia" w:hAnsi="Cambria Math"/>
+                    <w:color w:val="404040" w:themeColor="text1" w:themeTint="BF"/>
+                    <w:kern w:val="24"/>
+                  </w:rPr>
+                  <m:t>1</m:t>
+                </m:r>
+              </m:sub>
+            </m:sSub>
+            <m:r>
+              <w:rPr>
+                <w:rFonts w:ascii="Cambria Math" w:eastAsiaTheme="minorEastAsia" w:hAnsi="Cambria Math"/>
+                <w:color w:val="404040" w:themeColor="text1" w:themeTint="BF"/>
+                <w:kern w:val="24"/>
+              </w:rPr>
+              <m:t>+</m:t>
+            </m:r>
+            <m:sSub>
+              <m:sSubPr>
+                <m:ctrlPr>
+                  <w:rPr>
+                    <w:rFonts w:ascii="Cambria Math" w:eastAsiaTheme="minorEastAsia" w:hAnsi="Cambria Math"/>
+                    <w:i/>
+                    <w:color w:val="404040" w:themeColor="text1" w:themeTint="BF"/>
+                    <w:kern w:val="24"/>
+                  </w:rPr>
+                </m:ctrlPr>
+              </m:sSubPr>
+              <m:e>
+                <m:r>
+                  <w:rPr>
+                    <w:rFonts w:ascii="Cambria Math" w:eastAsiaTheme="minorEastAsia" w:hAnsi="Cambria Math"/>
+                    <w:color w:val="404040" w:themeColor="text1" w:themeTint="BF"/>
+                    <w:kern w:val="24"/>
+                  </w:rPr>
+                  <m:t>x</m:t>
+                </m:r>
+              </m:e>
+              <m:sub>
+                <m:r>
+                  <w:rPr>
+                    <w:rFonts w:ascii="Cambria Math" w:eastAsiaTheme="minorEastAsia" w:hAnsi="Cambria Math"/>
+                    <w:color w:val="404040" w:themeColor="text1" w:themeTint="BF"/>
+                    <w:kern w:val="24"/>
+                  </w:rPr>
+                  <m:t>2</m:t>
+                </m:r>
+              </m:sub>
+            </m:sSub>
+            <m:r>
+              <w:rPr>
+                <w:rFonts w:ascii="Cambria Math" w:eastAsiaTheme="minorEastAsia" w:hAnsi="Cambria Math"/>
+                <w:color w:val="404040" w:themeColor="text1" w:themeTint="BF"/>
+                <w:kern w:val="24"/>
+              </w:rPr>
+              <m:t>)</m:t>
+            </m:r>
+          </m:den>
+        </m:f>
+        <m:r>
+          <w:rPr>
+            <w:rFonts w:ascii="Cambria Math" w:eastAsiaTheme="minorEastAsia" w:hAnsi="Cambria Math"/>
+            <w:color w:val="404040" w:themeColor="text1" w:themeTint="BF"/>
+            <w:kern w:val="24"/>
+          </w:rPr>
+          <m:t>×100=</m:t>
+        </m:r>
+      </m:oMath>
+      <w:r>
+        <w:rPr>
+          <w:rFonts w:ascii="Aptos Narrow" w:hAnsi="Aptos Narrow"/>
+          <w:color w:val="000000"/>
+        </w:rPr>
+        <w:t xml:space="preserve"> </w:t>
+      </w:r>
+      <w:r>
+        <w:rPr>
+          <w:rFonts w:ascii="Aptos Narrow" w:hAnsi="Aptos Narrow"/>
+          <w:color w:val="000000"/>
+        </w:rPr>
+        <w:t>%</w:t>
+      </w:r>
+    </w:p>
+    <w:p>
+      <w:pPr>
+        <w:pStyle w:val="NormalWeb"/>
+        <w:spacing w:before="200" w:beforeAutospacing="0" w:after="0" w:afterAutospacing="0"/>
+        <w:ind w:left="720"/>
+        <w:rPr>
+          <w:rFonts w:eastAsiaTheme="minorEastAsia"/>
+          <w:color w:val="404040" w:themeColor="text1" w:themeTint="BF"/>
+          <w:kern w:val="24"/>
+        </w:rPr>
+      </w:pPr>
+      <w:r>
+        <w:rPr>
+          <w:rFonts w:eastAsiaTheme="minorEastAsia"/>
+          <w:color w:val="404040" w:themeColor="text1" w:themeTint="BF"/>
+          <w:kern w:val="24"/>
+        </w:rPr>
+        <w:tab/>
+        <w:t>2.</w:t>
+      </w:r>
+      <m:oMath>
+        <m:f>
+          <m:fPr>
+            <m:ctrlPr>
+              <w:rPr>
+                <w:rFonts w:ascii="Cambria Math" w:eastAsiaTheme="minorEastAsia" w:hAnsi="Cambria Math"/>
+                <w:i/>
+                <w:color w:val="404040" w:themeColor="text1" w:themeTint="BF"/>
+                <w:kern w:val="24"/>
+              </w:rPr>
+            </m:ctrlPr>
+          </m:fPr>
+          <m:num>
+            <m:d>
+              <m:dPr>
+                <m:begChr m:val="|"/>
+                <m:endChr m:val="|"/>
+                <m:ctrlPr>
+                  <w:rPr>
+                    <w:rFonts w:ascii="Cambria Math" w:eastAsiaTheme="minorEastAsia" w:hAnsi="Cambria Math"/>
+                    <w:i/>
+                    <w:color w:val="404040" w:themeColor="text1" w:themeTint="BF"/>
+                    <w:kern w:val="24"/>
+                  </w:rPr>
+                </m:ctrlPr>
+              </m:dPr>
+              <m:e>
+                <m:sSub>
+                  <m:sSubPr>
+                    <m:ctrlPr>
+                      <w:rPr>
+                        <w:rFonts w:ascii="Cambria Math" w:eastAsiaTheme="minorEastAsia" w:hAnsi="Cambria Math"/>
+                        <w:i/>
+                        <w:color w:val="404040" w:themeColor="text1" w:themeTint="BF"/>
+                        <w:kern w:val="24"/>
+                      </w:rPr>
+                    </m:ctrlPr>
+                  </m:sSubPr>
+                  <m:e>
+                    <m:r>
+                      <w:rPr>
+                        <w:rFonts w:ascii="Cambria Math" w:eastAsiaTheme="minorEastAsia" w:hAnsi="Cambria Math"/>
+                        <w:color w:val="404040" w:themeColor="text1" w:themeTint="BF"/>
+                        <w:kern w:val="24"/>
+                      </w:rPr>
+                      <m:t>x</m:t>
+                    </m:r>
+                  </m:e>
+                  <m:sub>
+                    <m:r>
+                      <w:rPr>
+                        <w:rFonts w:ascii="Cambria Math" w:eastAsiaTheme="minorEastAsia" w:hAnsi="Cambria Math"/>
+                        <w:color w:val="404040" w:themeColor="text1" w:themeTint="BF"/>
+                        <w:kern w:val="24"/>
+                      </w:rPr>
+                      <m:t>1</m:t>
+                    </m:r>
+                  </m:sub>
+                </m:sSub>
+                <m:r>
+                  <w:rPr>
+                    <w:rFonts w:ascii="Cambria Math" w:eastAsiaTheme="minorEastAsia" w:hAnsi="Cambria Math"/>
+                    <w:color w:val="404040" w:themeColor="text1" w:themeTint="BF"/>
+                    <w:kern w:val="24"/>
+                  </w:rPr>
+                  <m:t>-</m:t>
+                </m:r>
+                <m:sSub>
+                  <m:sSubPr>
+                    <m:ctrlPr>
+                      <w:rPr>
+                        <w:rFonts w:ascii="Cambria Math" w:eastAsiaTheme="minorEastAsia" w:hAnsi="Cambria Math"/>
+                        <w:i/>
+                        <w:color w:val="404040" w:themeColor="text1" w:themeTint="BF"/>
+                        <w:kern w:val="24"/>
+                      </w:rPr>
+                    </m:ctrlPr>
+                  </m:sSubPr>
+                  <m:e>
+                    <m:r>
+                      <w:rPr>
+                        <w:rFonts w:ascii="Cambria Math" w:eastAsiaTheme="minorEastAsia" w:hAnsi="Cambria Math"/>
+                        <w:color w:val="404040" w:themeColor="text1" w:themeTint="BF"/>
+                        <w:kern w:val="24"/>
+                      </w:rPr>
+                      <m:t>x</m:t>
+                    </m:r>
+                  </m:e>
+                  <m:sub>
+                    <m:r>
+                      <w:rPr>
+                        <w:rFonts w:ascii="Cambria Math" w:eastAsiaTheme="minorEastAsia" w:hAnsi="Cambria Math"/>
+                        <w:color w:val="404040" w:themeColor="text1" w:themeTint="BF"/>
+                        <w:kern w:val="24"/>
+                      </w:rPr>
+                      <m:t>2</m:t>
+                    </m:r>
+                  </m:sub>
+                </m:sSub>
+              </m:e>
+            </m:d>
+          </m:num>
+          <m:den>
+            <m:r>
+              <w:rPr>
+                <w:rFonts w:ascii="Cambria Math" w:eastAsiaTheme="minorEastAsia" w:hAnsi="Cambria Math"/>
+                <w:color w:val="404040" w:themeColor="text1" w:themeTint="BF"/>
+                <w:kern w:val="24"/>
+              </w:rPr>
+              <m:t>0.5(</m:t>
+            </m:r>
+            <m:sSub>
+              <m:sSubPr>
+                <m:ctrlPr>
+                  <w:rPr>
+                    <w:rFonts w:ascii="Cambria Math" w:eastAsiaTheme="minorEastAsia" w:hAnsi="Cambria Math"/>
+                    <w:i/>
+                    <w:color w:val="404040" w:themeColor="text1" w:themeTint="BF"/>
+                    <w:kern w:val="24"/>
+                  </w:rPr>
+                </m:ctrlPr>
+              </m:sSubPr>
+              <m:e>
+                <m:r>
+                  <w:rPr>
+                    <w:rFonts w:ascii="Cambria Math" w:eastAsiaTheme="minorEastAsia" w:hAnsi="Cambria Math"/>
+                    <w:color w:val="404040" w:themeColor="text1" w:themeTint="BF"/>
+                    <w:kern w:val="24"/>
+                  </w:rPr>
+                  <m:t>x</m:t>
+                </m:r>
+              </m:e>
+              <m:sub>
+                <m:r>
+                  <w:rPr>
+                    <w:rFonts w:ascii="Cambria Math" w:eastAsiaTheme="minorEastAsia" w:hAnsi="Cambria Math"/>
+                    <w:color w:val="404040" w:themeColor="text1" w:themeTint="BF"/>
+                    <w:kern w:val="24"/>
+                  </w:rPr>
+                  <m:t>1</m:t>
+                </m:r>
+              </m:sub>
+            </m:sSub>
+            <m:r>
+              <w:rPr>
+                <w:rFonts w:ascii="Cambria Math" w:eastAsiaTheme="minorEastAsia" w:hAnsi="Cambria Math"/>
+                <w:color w:val="404040" w:themeColor="text1" w:themeTint="BF"/>
+                <w:kern w:val="24"/>
+              </w:rPr>
+              <m:t>+</m:t>
+            </m:r>
+            <m:sSub>
+              <m:sSubPr>
+                <m:ctrlPr>
+                  <w:rPr>
+                    <w:rFonts w:ascii="Cambria Math" w:eastAsiaTheme="minorEastAsia" w:hAnsi="Cambria Math"/>
+                    <w:i/>
+                    <w:color w:val="404040" w:themeColor="text1" w:themeTint="BF"/>
+                    <w:kern w:val="24"/>
+                  </w:rPr>
+                </m:ctrlPr>
+              </m:sSubPr>
+              <m:e>
+                <m:r>
+                  <w:rPr>
+                    <w:rFonts w:ascii="Cambria Math" w:eastAsiaTheme="minorEastAsia" w:hAnsi="Cambria Math"/>
+                    <w:color w:val="404040" w:themeColor="text1" w:themeTint="BF"/>
+                    <w:kern w:val="24"/>
+                  </w:rPr>
+                  <m:t>x</m:t>
+                </m:r>
+              </m:e>
+              <m:sub>
+                <m:r>
+                  <w:rPr>
+                    <w:rFonts w:ascii="Cambria Math" w:eastAsiaTheme="minorEastAsia" w:hAnsi="Cambria Math"/>
+                    <w:color w:val="404040" w:themeColor="text1" w:themeTint="BF"/>
+                    <w:kern w:val="24"/>
+                  </w:rPr>
+                  <m:t>2</m:t>
+                </m:r>
+              </m:sub>
+            </m:sSub>
+            <m:r>
+              <w:rPr>
+                <w:rFonts w:ascii="Cambria Math" w:eastAsiaTheme="minorEastAsia" w:hAnsi="Cambria Math"/>
+                <w:color w:val="404040" w:themeColor="text1" w:themeTint="BF"/>
+                <w:kern w:val="24"/>
+              </w:rPr>
+              <m:t>)</m:t>
+            </m:r>
+          </m:den>
+        </m:f>
+        <m:r>
+          <w:rPr>
+            <w:rFonts w:ascii="Cambria Math" w:eastAsiaTheme="minorEastAsia" w:hAnsi="Cambria Math"/>
+            <w:color w:val="404040" w:themeColor="text1" w:themeTint="BF"/>
+            <w:kern w:val="24"/>
+          </w:rPr>
+          <m:t>×100=</m:t>
+        </m:r>
+        <m:r>
+          <w:rPr>
+            <w:rFonts w:ascii="Cambria Math" w:eastAsiaTheme="minorEastAsia" w:hAnsi="Cambria Math"/>
+            <w:color w:val="404040" w:themeColor="text1" w:themeTint="BF"/>
+            <w:kern w:val="24"/>
+          </w:rPr>
+          <m:t>%</m:t>
+        </m:r>
+      </m:oMath>
+    </w:p>
+    <w:p>
+      <w:pPr>
+        <w:pStyle w:val="NormalWeb"/>
+        <w:spacing w:before="200" w:beforeAutospacing="0" w:after="0" w:afterAutospacing="0"/>
+        <w:ind w:left="720"/>
+        <w:rPr>
+          <w:rFonts w:eastAsiaTheme="minorEastAsia"/>
+          <w:color w:val="404040" w:themeColor="text1" w:themeTint="BF"/>
+          <w:kern w:val="24"/>
+        </w:rPr>
+      </w:pPr>
+      <w:r>
+        <w:rPr>
+          <w:rFonts w:eastAsiaTheme="minorEastAsia"/>
+          <w:color w:val="404040" w:themeColor="text1" w:themeTint="BF"/>
+          <w:kern w:val="24"/>
+        </w:rPr>
+        <w:t>Elastic 2:</w:t>
+      </w:r>
+    </w:p>
+    <w:p>
+      <w:pPr>
+        <w:pStyle w:val="NormalWeb"/>
+        <w:spacing w:before="200" w:beforeAutospacing="0" w:after="0" w:afterAutospacing="0"/>
+        <w:ind w:left="720"/>
+        <w:rPr>
+          <w:rFonts w:eastAsiaTheme="minorEastAsia"/>
+          <w:color w:val="404040" w:themeColor="text1" w:themeTint="BF"/>
+          <w:kern w:val="24"/>
+        </w:rPr>
+      </w:pPr>
+      <w:r>
+        <w:rPr>
+          <w:rFonts w:eastAsiaTheme="minorEastAsia"/>
+          <w:color w:val="404040" w:themeColor="text1" w:themeTint="BF"/>
+          <w:kern w:val="24"/>
+        </w:rPr>
+        <w:tab/>
+        <w:t xml:space="preserve">1. </w:t>
+      </w:r>
+      <m:oMath>
+        <m:f>
+          <m:fPr>
+            <m:ctrlPr>
+              <w:rPr>
+                <w:rFonts w:ascii="Cambria Math" w:eastAsiaTheme="minorEastAsia" w:hAnsi="Cambria Math"/>
+                <w:i/>
+                <w:color w:val="404040" w:themeColor="text1" w:themeTint="BF"/>
+                <w:kern w:val="24"/>
+              </w:rPr>
+            </m:ctrlPr>
+          </m:fPr>
+          <m:num>
+            <m:d>
+              <m:dPr>
+                <m:begChr m:val="|"/>
+                <m:endChr m:val="|"/>
+                <m:ctrlPr>
+                  <w:rPr>
+                    <w:rFonts w:ascii="Cambria Math" w:eastAsiaTheme="minorEastAsia" w:hAnsi="Cambria Math"/>
+                    <w:i/>
+                    <w:color w:val="404040" w:themeColor="text1" w:themeTint="BF"/>
+                    <w:kern w:val="24"/>
+                  </w:rPr>
+                </m:ctrlPr>
+              </m:dPr>
+              <m:e>
+                <m:sSub>
+                  <m:sSubPr>
+                    <m:ctrlPr>
+                      <w:rPr>
+                        <w:rFonts w:ascii="Cambria Math" w:eastAsiaTheme="minorEastAsia" w:hAnsi="Cambria Math"/>
+                        <w:i/>
+                        <w:color w:val="404040" w:themeColor="text1" w:themeTint="BF"/>
+                        <w:kern w:val="24"/>
+                      </w:rPr>
+                    </m:ctrlPr>
+                  </m:sSubPr>
+                  <m:e>
+                    <m:r>
+                      <w:rPr>
+                        <w:rFonts w:ascii="Cambria Math" w:eastAsiaTheme="minorEastAsia" w:hAnsi="Cambria Math"/>
+                        <w:color w:val="404040" w:themeColor="text1" w:themeTint="BF"/>
+                        <w:kern w:val="24"/>
+                      </w:rPr>
+                      <m:t>x</m:t>
+                    </m:r>
+                  </m:e>
+                  <m:sub>
+                    <m:r>
+                      <w:rPr>
+                        <w:rFonts w:ascii="Cambria Math" w:eastAsiaTheme="minorEastAsia" w:hAnsi="Cambria Math"/>
+                        <w:color w:val="404040" w:themeColor="text1" w:themeTint="BF"/>
+                        <w:kern w:val="24"/>
+                      </w:rPr>
+                      <m:t>1</m:t>
+                    </m:r>
+                  </m:sub>
+                </m:sSub>
+                <m:r>
+                  <w:rPr>
+                    <w:rFonts w:ascii="Cambria Math" w:eastAsiaTheme="minorEastAsia" w:hAnsi="Cambria Math"/>
+                    <w:color w:val="404040" w:themeColor="text1" w:themeTint="BF"/>
+                    <w:kern w:val="24"/>
+                  </w:rPr>
+                  <m:t>-</m:t>
+                </m:r>
+                <m:sSub>
+                  <m:sSubPr>
+                    <m:ctrlPr>
+                      <w:rPr>
+                        <w:rFonts w:ascii="Cambria Math" w:eastAsiaTheme="minorEastAsia" w:hAnsi="Cambria Math"/>
+                        <w:i/>
+                        <w:color w:val="404040" w:themeColor="text1" w:themeTint="BF"/>
+                        <w:kern w:val="24"/>
+                      </w:rPr>
+                    </m:ctrlPr>
+                  </m:sSubPr>
+                  <m:e>
+                    <m:r>
+                      <w:rPr>
+                        <w:rFonts w:ascii="Cambria Math" w:eastAsiaTheme="minorEastAsia" w:hAnsi="Cambria Math"/>
+                        <w:color w:val="404040" w:themeColor="text1" w:themeTint="BF"/>
+                        <w:kern w:val="24"/>
+                      </w:rPr>
+                      <m:t>x</m:t>
+                    </m:r>
+                  </m:e>
+                  <m:sub>
+                    <m:r>
+                      <w:rPr>
+                        <w:rFonts w:ascii="Cambria Math" w:eastAsiaTheme="minorEastAsia" w:hAnsi="Cambria Math"/>
+                        <w:color w:val="404040" w:themeColor="text1" w:themeTint="BF"/>
+                        <w:kern w:val="24"/>
+                      </w:rPr>
+                      <m:t>2</m:t>
+                    </m:r>
+                  </m:sub>
+                </m:sSub>
+              </m:e>
+            </m:d>
+          </m:num>
+          <m:den>
+            <m:r>
+              <w:rPr>
+                <w:rFonts w:ascii="Cambria Math" w:eastAsiaTheme="minorEastAsia" w:hAnsi="Cambria Math"/>
+                <w:color w:val="404040" w:themeColor="text1" w:themeTint="BF"/>
+                <w:kern w:val="24"/>
+              </w:rPr>
+              <m:t>0.5(</m:t>
+            </m:r>
+            <m:sSub>
+              <m:sSubPr>
+                <m:ctrlPr>
+                  <w:rPr>
+                    <w:rFonts w:ascii="Cambria Math" w:eastAsiaTheme="minorEastAsia" w:hAnsi="Cambria Math"/>
+                    <w:i/>
+                    <w:color w:val="404040" w:themeColor="text1" w:themeTint="BF"/>
+                    <w:kern w:val="24"/>
+                  </w:rPr>
+                </m:ctrlPr>
+              </m:sSubPr>
+              <m:e>
+                <m:r>
+                  <w:rPr>
+                    <w:rFonts w:ascii="Cambria Math" w:eastAsiaTheme="minorEastAsia" w:hAnsi="Cambria Math"/>
+                    <w:color w:val="404040" w:themeColor="text1" w:themeTint="BF"/>
+                    <w:kern w:val="24"/>
+                  </w:rPr>
+                  <m:t>x</m:t>
+                </m:r>
+              </m:e>
+              <m:sub>
+                <m:r>
+                  <w:rPr>
+                    <w:rFonts w:ascii="Cambria Math" w:eastAsiaTheme="minorEastAsia" w:hAnsi="Cambria Math"/>
+                    <w:color w:val="404040" w:themeColor="text1" w:themeTint="BF"/>
+                    <w:kern w:val="24"/>
+                  </w:rPr>
+                  <m:t>1</m:t>
+                </m:r>
+              </m:sub>
+            </m:sSub>
+            <m:r>
+              <w:rPr>
+                <w:rFonts w:ascii="Cambria Math" w:eastAsiaTheme="minorEastAsia" w:hAnsi="Cambria Math"/>
+                <w:color w:val="404040" w:themeColor="text1" w:themeTint="BF"/>
+                <w:kern w:val="24"/>
+              </w:rPr>
+              <m:t>+</m:t>
+            </m:r>
+            <m:sSub>
+              <m:sSubPr>
+                <m:ctrlPr>
+                  <w:rPr>
+                    <w:rFonts w:ascii="Cambria Math" w:eastAsiaTheme="minorEastAsia" w:hAnsi="Cambria Math"/>
+                    <w:i/>
+                    <w:color w:val="404040" w:themeColor="text1" w:themeTint="BF"/>
+                    <w:kern w:val="24"/>
+                  </w:rPr>
+                </m:ctrlPr>
+              </m:sSubPr>
+              <m:e>
+                <m:r>
+                  <w:rPr>
+                    <w:rFonts w:ascii="Cambria Math" w:eastAsiaTheme="minorEastAsia" w:hAnsi="Cambria Math"/>
+                    <w:color w:val="404040" w:themeColor="text1" w:themeTint="BF"/>
+                    <w:kern w:val="24"/>
+                  </w:rPr>
+                  <m:t>x</m:t>
+                </m:r>
+              </m:e>
+              <m:sub>
+                <m:r>
+                  <w:rPr>
+                    <w:rFonts w:ascii="Cambria Math" w:eastAsiaTheme="minorEastAsia" w:hAnsi="Cambria Math"/>
+                    <w:color w:val="404040" w:themeColor="text1" w:themeTint="BF"/>
+                    <w:kern w:val="24"/>
+                  </w:rPr>
+                  <m:t>2</m:t>
+                </m:r>
+              </m:sub>
+            </m:sSub>
+            <m:r>
+              <w:rPr>
+                <w:rFonts w:ascii="Cambria Math" w:eastAsiaTheme="minorEastAsia" w:hAnsi="Cambria Math"/>
+                <w:color w:val="404040" w:themeColor="text1" w:themeTint="BF"/>
+                <w:kern w:val="24"/>
+              </w:rPr>
+              <m:t>)</m:t>
+            </m:r>
+          </m:den>
+        </m:f>
+        <m:r>
+          <w:rPr>
+            <w:rFonts w:ascii="Cambria Math" w:eastAsiaTheme="minorEastAsia" w:hAnsi="Cambria Math"/>
+            <w:color w:val="404040" w:themeColor="text1" w:themeTint="BF"/>
+            <w:kern w:val="24"/>
+          </w:rPr>
+          <m:t>×100=</m:t>
+        </m:r>
+        <m:r>
+          <w:rPr>
+            <w:rFonts w:ascii="Cambria Math" w:eastAsiaTheme="minorEastAsia" w:hAnsi="Cambria Math"/>
+            <w:color w:val="404040" w:themeColor="text1" w:themeTint="BF"/>
+            <w:kern w:val="24"/>
+          </w:rPr>
+          <m:t>%</m:t>
+        </m:r>
+      </m:oMath>
+    </w:p>
+    <w:p>
+      <w:pPr>
+        <w:pStyle w:val="NormalWeb"/>
+        <w:spacing w:before="200" w:beforeAutospacing="0" w:after="0" w:afterAutospacing="0"/>
+        <w:ind w:left="720" w:firstLine="720"/>
+        <w:rPr>
+          <w:rFonts w:eastAsiaTheme="minorEastAsia"/>
+          <w:color w:val="404040" w:themeColor="text1" w:themeTint="BF"/>
+          <w:kern w:val="24"/>
+        </w:rPr>
+      </w:pPr>
+      <w:r>
+        <w:rPr>
+          <w:rFonts w:eastAsiaTheme="minorEastAsia"/>
+          <w:color w:val="404040" w:themeColor="text1" w:themeTint="BF"/>
+          <w:kern w:val="24"/>
+        </w:rPr>
+        <w:t xml:space="preserve">2. </w:t>
+      </w:r>
+      <m:oMath>
+        <m:f>
+          <m:fPr>
+            <m:ctrlPr>
+              <w:rPr>
+                <w:rFonts w:ascii="Cambria Math" w:eastAsiaTheme="minorEastAsia" w:hAnsi="Cambria Math"/>
+                <w:i/>
+                <w:color w:val="404040" w:themeColor="text1" w:themeTint="BF"/>
+                <w:kern w:val="24"/>
+              </w:rPr>
+            </m:ctrlPr>
+          </m:fPr>
+          <m:num>
+            <m:d>
+              <m:dPr>
+                <m:begChr m:val="|"/>
+                <m:endChr m:val="|"/>
+                <m:ctrlPr>
+                  <w:rPr>
+                    <w:rFonts w:ascii="Cambria Math" w:eastAsiaTheme="minorEastAsia" w:hAnsi="Cambria Math"/>
+                    <w:i/>
+                    <w:color w:val="404040" w:themeColor="text1" w:themeTint="BF"/>
+                    <w:kern w:val="24"/>
+                  </w:rPr>
+                </m:ctrlPr>
+              </m:dPr>
+              <m:e>
+                <m:sSub>
+                  <m:sSubPr>
+                    <m:ctrlPr>
+                      <w:rPr>
+                        <w:rFonts w:ascii="Cambria Math" w:eastAsiaTheme="minorEastAsia" w:hAnsi="Cambria Math"/>
+                        <w:i/>
+                        <w:color w:val="404040" w:themeColor="text1" w:themeTint="BF"/>
+                        <w:kern w:val="24"/>
+                      </w:rPr>
+                    </m:ctrlPr>
+                  </m:sSubPr>
+                  <m:e>
+                    <m:r>
+                      <w:rPr>
+                        <w:rFonts w:ascii="Cambria Math" w:eastAsiaTheme="minorEastAsia" w:hAnsi="Cambria Math"/>
+                        <w:color w:val="404040" w:themeColor="text1" w:themeTint="BF"/>
+                        <w:kern w:val="24"/>
+                      </w:rPr>
+                      <m:t>x</m:t>
+                    </m:r>
+                  </m:e>
+                  <m:sub>
+                    <m:r>
+                      <w:rPr>
+                        <w:rFonts w:ascii="Cambria Math" w:eastAsiaTheme="minorEastAsia" w:hAnsi="Cambria Math"/>
+                        <w:color w:val="404040" w:themeColor="text1" w:themeTint="BF"/>
+                        <w:kern w:val="24"/>
+                      </w:rPr>
+                      <m:t>1</m:t>
+                    </m:r>
+                  </m:sub>
+                </m:sSub>
+                <m:r>
+                  <w:rPr>
+                    <w:rFonts w:ascii="Cambria Math" w:eastAsiaTheme="minorEastAsia" w:hAnsi="Cambria Math"/>
+                    <w:color w:val="404040" w:themeColor="text1" w:themeTint="BF"/>
+                    <w:kern w:val="24"/>
+                  </w:rPr>
+                  <m:t>-</m:t>
+                </m:r>
+                <m:sSub>
+                  <m:sSubPr>
+                    <m:ctrlPr>
+                      <w:rPr>
+                        <w:rFonts w:ascii="Cambria Math" w:eastAsiaTheme="minorEastAsia" w:hAnsi="Cambria Math"/>
+                        <w:i/>
+                        <w:color w:val="404040" w:themeColor="text1" w:themeTint="BF"/>
+                        <w:kern w:val="24"/>
+                      </w:rPr>
+                    </m:ctrlPr>
+                  </m:sSubPr>
+                  <m:e>
+                    <m:r>
+                      <w:rPr>
+                        <w:rFonts w:ascii="Cambria Math" w:eastAsiaTheme="minorEastAsia" w:hAnsi="Cambria Math"/>
+                        <w:color w:val="404040" w:themeColor="text1" w:themeTint="BF"/>
+                        <w:kern w:val="24"/>
+                      </w:rPr>
+                      <m:t>x</m:t>
+                    </m:r>
+                  </m:e>
+                  <m:sub>
+                    <m:r>
+                      <w:rPr>
+                        <w:rFonts w:ascii="Cambria Math" w:eastAsiaTheme="minorEastAsia" w:hAnsi="Cambria Math"/>
+                        <w:color w:val="404040" w:themeColor="text1" w:themeTint="BF"/>
+                        <w:kern w:val="24"/>
+                      </w:rPr>
+                      <m:t>2</m:t>
+                    </m:r>
+                  </m:sub>
+                </m:sSub>
+              </m:e>
+            </m:d>
+          </m:num>
+          <m:den>
+            <m:r>
+              <w:rPr>
+                <w:rFonts w:ascii="Cambria Math" w:eastAsiaTheme="minorEastAsia" w:hAnsi="Cambria Math"/>
+                <w:color w:val="404040" w:themeColor="text1" w:themeTint="BF"/>
+                <w:kern w:val="24"/>
+              </w:rPr>
+              <m:t>0.5(</m:t>
+            </m:r>
+            <m:sSub>
+              <m:sSubPr>
+                <m:ctrlPr>
+                  <w:rPr>
+                    <w:rFonts w:ascii="Cambria Math" w:eastAsiaTheme="minorEastAsia" w:hAnsi="Cambria Math"/>
+                    <w:i/>
+                    <w:color w:val="404040" w:themeColor="text1" w:themeTint="BF"/>
+                    <w:kern w:val="24"/>
+                  </w:rPr>
+                </m:ctrlPr>
+              </m:sSubPr>
+              <m:e>
+                <m:r>
+                  <w:rPr>
+                    <w:rFonts w:ascii="Cambria Math" w:eastAsiaTheme="minorEastAsia" w:hAnsi="Cambria Math"/>
+                    <w:color w:val="404040" w:themeColor="text1" w:themeTint="BF"/>
+                    <w:kern w:val="24"/>
+                  </w:rPr>
+                  <m:t>x</m:t>
+                </m:r>
+              </m:e>
+              <m:sub>
+                <m:r>
+                  <w:rPr>
+                    <w:rFonts w:ascii="Cambria Math" w:eastAsiaTheme="minorEastAsia" w:hAnsi="Cambria Math"/>
+                    <w:color w:val="404040" w:themeColor="text1" w:themeTint="BF"/>
+                    <w:kern w:val="24"/>
+                  </w:rPr>
+                  <m:t>1</m:t>
+                </m:r>
+              </m:sub>
+            </m:sSub>
+            <m:r>
+              <w:rPr>
+                <w:rFonts w:ascii="Cambria Math" w:eastAsiaTheme="minorEastAsia" w:hAnsi="Cambria Math"/>
+                <w:color w:val="404040" w:themeColor="text1" w:themeTint="BF"/>
+                <w:kern w:val="24"/>
+              </w:rPr>
+              <m:t>+</m:t>
+            </m:r>
+            <m:sSub>
+              <m:sSubPr>
+                <m:ctrlPr>
+                  <w:rPr>
+                    <w:rFonts w:ascii="Cambria Math" w:eastAsiaTheme="minorEastAsia" w:hAnsi="Cambria Math"/>
+                    <w:i/>
+                    <w:color w:val="404040" w:themeColor="text1" w:themeTint="BF"/>
+                    <w:kern w:val="24"/>
+                  </w:rPr>
+                </m:ctrlPr>
+              </m:sSubPr>
+              <m:e>
+                <m:r>
+                  <w:rPr>
+                    <w:rFonts w:ascii="Cambria Math" w:eastAsiaTheme="minorEastAsia" w:hAnsi="Cambria Math"/>
+                    <w:color w:val="404040" w:themeColor="text1" w:themeTint="BF"/>
+                    <w:kern w:val="24"/>
+                  </w:rPr>
+                  <m:t>x</m:t>
+                </m:r>
+              </m:e>
+              <m:sub>
+                <m:r>
+                  <w:rPr>
+                    <w:rFonts w:ascii="Cambria Math" w:eastAsiaTheme="minorEastAsia" w:hAnsi="Cambria Math"/>
+                    <w:color w:val="404040" w:themeColor="text1" w:themeTint="BF"/>
+                    <w:kern w:val="24"/>
+                  </w:rPr>
+                  <m:t>2</m:t>
+                </m:r>
+              </m:sub>
+            </m:sSub>
+            <m:r>
+              <w:rPr>
+                <w:rFonts w:ascii="Cambria Math" w:eastAsiaTheme="minorEastAsia" w:hAnsi="Cambria Math"/>
+                <w:color w:val="404040" w:themeColor="text1" w:themeTint="BF"/>
+                <w:kern w:val="24"/>
+              </w:rPr>
+              <m:t>)</m:t>
+            </m:r>
+          </m:den>
+        </m:f>
+        <m:r>
+          <w:rPr>
+            <w:rFonts w:ascii="Cambria Math" w:eastAsiaTheme="minorEastAsia" w:hAnsi="Cambria Math"/>
+            <w:color w:val="404040" w:themeColor="text1" w:themeTint="BF"/>
+            <w:kern w:val="24"/>
+          </w:rPr>
+          <m:t>×100=</m:t>
+        </m:r>
+      </m:oMath>
+      <w:r>
+        <w:rPr>
+          <w:rFonts w:ascii="Aptos Narrow" w:hAnsi="Aptos Narrow"/>
+          <w:color w:val="000000"/>
+        </w:rPr>
+        <w:t>%</w:t>
+      </w:r>
     </w:p>
     <w:p>
       <w:pPr>
         <w:pStyle w:val="NormalWeb"/>
         <w:numPr>
           <w:ilvl w:val="0"/>
-          <w:numId w:val="2"/>
+          <w:numId w:val="4"/>
         </w:numPr>
         <w:spacing w:before="200" w:beforeAutospacing="0" w:after="0" w:afterAutospacing="0"/>
         <w:rPr>
+          <w:rFonts w:eastAsiaTheme="minorEastAsia"/>
+          <w:color w:val="404040" w:themeColor="text1" w:themeTint="BF"/>
+          <w:kern w:val="24"/>
+        </w:rPr>
+      </w:pPr>
+      <w:r>
+        <w:rPr>
+          <w:rFonts w:eastAsiaTheme="minorEastAsia"/>
+          <w:color w:val="404040" w:themeColor="text1" w:themeTint="BF"/>
+          <w:kern w:val="24"/>
+        </w:rPr>
+        <w:t>Do</w:t>
+      </w:r>
+      <w:r>
+        <w:rPr>
+          <w:rFonts w:eastAsiaTheme="minorEastAsia"/>
+          <w:color w:val="404040" w:themeColor="text1" w:themeTint="BF"/>
+          <w:kern w:val="24"/>
+        </w:rPr>
+        <w:t>es</w:t>
+      </w:r>
+      <w:r>
+        <w:rPr>
+          <w:rFonts w:eastAsiaTheme="minorEastAsia"/>
+          <w:color w:val="404040" w:themeColor="text1" w:themeTint="BF"/>
+          <w:kern w:val="24"/>
+        </w:rPr>
+        <w:t xml:space="preserve"> your data support the impulse-momentum </w:t>
+      </w:r>
+      <w:r>
+        <w:rPr>
+          <w:rFonts w:eastAsiaTheme="minorEastAsia"/>
+          <w:color w:val="404040" w:themeColor="text1" w:themeTint="BF"/>
+          <w:kern w:val="24"/>
+        </w:rPr>
+        <w:t>t</w:t>
+      </w:r>
+      <w:r>
+        <w:rPr>
+          <w:rFonts w:eastAsiaTheme="minorEastAsia"/>
+          <w:color w:val="404040" w:themeColor="text1" w:themeTint="BF"/>
+          <w:kern w:val="24"/>
+        </w:rPr>
+        <w:t>heorem? Explain.</w:t>
+      </w:r>
+    </w:p>
+    <w:p>
+      <w:pPr>
+        <w:pStyle w:val="NormalWeb"/>
+        <w:numPr>
+          <w:ilvl w:val="0"/>
+          <w:numId w:val="4"/>
+        </w:numPr>
+        <w:spacing w:before="200" w:beforeAutospacing="0" w:after="0" w:afterAutospacing="0"/>
+        <w:rPr>
           <w:sz w:val="16"/>
           <w:szCs w:val="16"/>
         </w:rPr>
@@ -2206,19 +5271,9 @@
           <w:color w:val="404040" w:themeColor="text1" w:themeTint="BF"/>
           <w:kern w:val="24"/>
         </w:rPr>
-        <w:tab/>
+        <w:lastRenderedPageBreak/>
         <w:t xml:space="preserve">Look at the shape of the last force vs. time graph. </w:t>
       </w:r>
-    </w:p>
-    <w:p>
-      <w:pPr>
-        <w:pStyle w:val="NormalWeb"/>
-        <w:spacing w:before="200" w:beforeAutospacing="0" w:after="0" w:afterAutospacing="0"/>
-        <w:rPr>
-          <w:sz w:val="16"/>
-          <w:szCs w:val="16"/>
-        </w:rPr>
-      </w:pPr>
       <w:r>
         <w:rPr>
           <w:rFonts w:eastAsiaTheme="minorEastAsia"/>
@@ -2254,6 +5309,7 @@
       <w:pPr>
         <w:pStyle w:val="NormalWeb"/>
         <w:spacing w:before="200" w:beforeAutospacing="0" w:after="0" w:afterAutospacing="0"/>
+        <w:ind w:firstLine="360"/>
         <w:rPr>
           <w:sz w:val="18"/>
           <w:szCs w:val="18"/>
@@ -2265,15 +5321,14 @@
           <w:color w:val="404040" w:themeColor="text1" w:themeTint="BF"/>
           <w:kern w:val="24"/>
         </w:rPr>
-        <w:t>6.</w:t>
-      </w:r>
-      <w:r>
-        <w:rPr>
-          <w:rFonts w:eastAsiaTheme="minorEastAsia"/>
-          <w:color w:val="404040" w:themeColor="text1" w:themeTint="BF"/>
-          <w:kern w:val="24"/>
-        </w:rPr>
-        <w:tab/>
+        <w:t xml:space="preserve">6. </w:t>
+      </w:r>
+      <w:r>
+        <w:rPr>
+          <w:rFonts w:eastAsiaTheme="minorEastAsia"/>
+          <w:color w:val="404040" w:themeColor="text1" w:themeTint="BF"/>
+          <w:kern w:val="24"/>
+        </w:rPr>
         <w:t xml:space="preserve">When you used a stiffer or tighter elastic material, what effect did this have on the duration of the impulse? </w:t>
       </w:r>
     </w:p>
@@ -2360,7 +5415,7 @@
         <w:pStyle w:val="NormalWeb"/>
         <w:numPr>
           <w:ilvl w:val="0"/>
-          <w:numId w:val="3"/>
+          <w:numId w:val="5"/>
         </w:numPr>
         <w:spacing w:before="200" w:beforeAutospacing="0" w:after="0" w:afterAutospacing="0"/>
         <w:rPr>
@@ -2375,7 +5430,6 @@
           <w:color w:val="404040" w:themeColor="text1" w:themeTint="BF"/>
           <w:kern w:val="24"/>
         </w:rPr>
-        <w:tab/>
         <w:t>Give one random error for this experiment. Say explicitly why it is a random error.</w:t>
       </w:r>
     </w:p>
@@ -2394,7 +5448,7 @@
         <w:pStyle w:val="NormalWeb"/>
         <w:numPr>
           <w:ilvl w:val="0"/>
-          <w:numId w:val="3"/>
+          <w:numId w:val="5"/>
         </w:numPr>
         <w:spacing w:before="200" w:beforeAutospacing="0" w:after="0" w:afterAutospacing="0"/>
         <w:rPr>
@@ -2408,7 +5462,6 @@
           <w:color w:val="404040" w:themeColor="text1" w:themeTint="BF"/>
           <w:kern w:val="24"/>
         </w:rPr>
-        <w:tab/>
         <w:t>Give one systematic error for this experiment. Say explicitly why it is a systematic error.</w:t>
       </w:r>
     </w:p>
@@ -2427,7 +5480,6 @@
       <w:pgSz w:w="12240" w:h="15840" w:code="1"/>
       <w:pgMar w:top="720" w:right="720" w:bottom="720" w:left="720" w:header="720" w:footer="720" w:gutter="0"/>
       <w:cols w:space="720"/>
-      <w:vAlign w:val="center"/>
       <w:docGrid w:linePitch="360"/>
     </w:sectPr>
   </w:body>
@@ -2488,6 +5540,97 @@
     </w:lvl>
   </w:abstractNum>
   <w:abstractNum w:abstractNumId="1" w15:restartNumberingAfterBreak="0">
+    <w:nsid w:val="1B06627C"/>
+    <w:multiLevelType w:val="hybridMultilevel"/>
+    <w:tmpl w:val="9B0805F0"/>
+    <w:lvl w:ilvl="0" w:tplc="231C3B6A">
+      <w:start w:val="1"/>
+      <w:numFmt w:val="decimal"/>
+      <w:lvlText w:val="%1."/>
+      <w:lvlJc w:val="left"/>
+      <w:pPr>
+        <w:ind w:left="720" w:hanging="360"/>
+      </w:pPr>
+      <w:rPr>
+        <w:rFonts w:eastAsiaTheme="minorEastAsia" w:hint="default"/>
+        <w:color w:val="404040" w:themeColor="text1" w:themeTint="BF"/>
+        <w:sz w:val="24"/>
+      </w:rPr>
+    </w:lvl>
+    <w:lvl w:ilvl="1" w:tplc="04090019" w:tentative="1">
+      <w:start w:val="1"/>
+      <w:numFmt w:val="lowerLetter"/>
+      <w:lvlText w:val="%2."/>
+      <w:lvlJc w:val="left"/>
+      <w:pPr>
+        <w:ind w:left="1440" w:hanging="360"/>
+      </w:pPr>
+    </w:lvl>
+    <w:lvl w:ilvl="2" w:tplc="0409001B" w:tentative="1">
+      <w:start w:val="1"/>
+      <w:numFmt w:val="lowerRoman"/>
+      <w:lvlText w:val="%3."/>
+      <w:lvlJc w:val="right"/>
+      <w:pPr>
+        <w:ind w:left="2160" w:hanging="180"/>
+      </w:pPr>
+    </w:lvl>
+    <w:lvl w:ilvl="3" w:tplc="0409000F" w:tentative="1">
+      <w:start w:val="1"/>
+      <w:numFmt w:val="decimal"/>
+      <w:lvlText w:val="%4."/>
+      <w:lvlJc w:val="left"/>
+      <w:pPr>
+        <w:ind w:left="2880" w:hanging="360"/>
+      </w:pPr>
+    </w:lvl>
+    <w:lvl w:ilvl="4" w:tplc="04090019" w:tentative="1">
+      <w:start w:val="1"/>
+      <w:numFmt w:val="lowerLetter"/>
+      <w:lvlText w:val="%5."/>
+      <w:lvlJc w:val="left"/>
+      <w:pPr>
+        <w:ind w:left="3600" w:hanging="360"/>
+      </w:pPr>
+    </w:lvl>
+    <w:lvl w:ilvl="5" w:tplc="0409001B" w:tentative="1">
+      <w:start w:val="1"/>
+      <w:numFmt w:val="lowerRoman"/>
+      <w:lvlText w:val="%6."/>
+      <w:lvlJc w:val="right"/>
+      <w:pPr>
+        <w:ind w:left="4320" w:hanging="180"/>
+      </w:pPr>
+    </w:lvl>
+    <w:lvl w:ilvl="6" w:tplc="0409000F" w:tentative="1">
+      <w:start w:val="1"/>
+      <w:numFmt w:val="decimal"/>
+      <w:lvlText w:val="%7."/>
+      <w:lvlJc w:val="left"/>
+      <w:pPr>
+        <w:ind w:left="5040" w:hanging="360"/>
+      </w:pPr>
+    </w:lvl>
+    <w:lvl w:ilvl="7" w:tplc="04090019" w:tentative="1">
+      <w:start w:val="1"/>
+      <w:numFmt w:val="lowerLetter"/>
+      <w:lvlText w:val="%8."/>
+      <w:lvlJc w:val="left"/>
+      <w:pPr>
+        <w:ind w:left="5760" w:hanging="360"/>
+      </w:pPr>
+    </w:lvl>
+    <w:lvl w:ilvl="8" w:tplc="0409001B" w:tentative="1">
+      <w:start w:val="1"/>
+      <w:numFmt w:val="lowerRoman"/>
+      <w:lvlText w:val="%9."/>
+      <w:lvlJc w:val="right"/>
+      <w:pPr>
+        <w:ind w:left="6480" w:hanging="180"/>
+      </w:pPr>
+    </w:lvl>
+  </w:abstractNum>
+  <w:abstractNum w:abstractNumId="2" w15:restartNumberingAfterBreak="0">
     <w:nsid w:val="26082C9D"/>
     <w:multiLevelType w:val="multilevel"/>
     <w:tmpl w:val="7FC29790"/>
@@ -2538,7 +5681,98 @@
       <w:lvlJc w:val="left"/>
     </w:lvl>
   </w:abstractNum>
-  <w:abstractNum w:abstractNumId="2" w15:restartNumberingAfterBreak="0">
+  <w:abstractNum w:abstractNumId="3" w15:restartNumberingAfterBreak="0">
+    <w:nsid w:val="529A2CB9"/>
+    <w:multiLevelType w:val="hybridMultilevel"/>
+    <w:tmpl w:val="3CCA7576"/>
+    <w:lvl w:ilvl="0" w:tplc="7D0CC732">
+      <w:start w:val="7"/>
+      <w:numFmt w:val="decimal"/>
+      <w:lvlText w:val="%1."/>
+      <w:lvlJc w:val="left"/>
+      <w:pPr>
+        <w:ind w:left="720" w:hanging="360"/>
+      </w:pPr>
+      <w:rPr>
+        <w:rFonts w:eastAsiaTheme="minorEastAsia" w:hint="default"/>
+        <w:color w:val="404040" w:themeColor="text1" w:themeTint="BF"/>
+        <w:sz w:val="24"/>
+      </w:rPr>
+    </w:lvl>
+    <w:lvl w:ilvl="1" w:tplc="04090019" w:tentative="1">
+      <w:start w:val="1"/>
+      <w:numFmt w:val="lowerLetter"/>
+      <w:lvlText w:val="%2."/>
+      <w:lvlJc w:val="left"/>
+      <w:pPr>
+        <w:ind w:left="1440" w:hanging="360"/>
+      </w:pPr>
+    </w:lvl>
+    <w:lvl w:ilvl="2" w:tplc="0409001B" w:tentative="1">
+      <w:start w:val="1"/>
+      <w:numFmt w:val="lowerRoman"/>
+      <w:lvlText w:val="%3."/>
+      <w:lvlJc w:val="right"/>
+      <w:pPr>
+        <w:ind w:left="2160" w:hanging="180"/>
+      </w:pPr>
+    </w:lvl>
+    <w:lvl w:ilvl="3" w:tplc="0409000F" w:tentative="1">
+      <w:start w:val="1"/>
+      <w:numFmt w:val="decimal"/>
+      <w:lvlText w:val="%4."/>
+      <w:lvlJc w:val="left"/>
+      <w:pPr>
+        <w:ind w:left="2880" w:hanging="360"/>
+      </w:pPr>
+    </w:lvl>
+    <w:lvl w:ilvl="4" w:tplc="04090019" w:tentative="1">
+      <w:start w:val="1"/>
+      <w:numFmt w:val="lowerLetter"/>
+      <w:lvlText w:val="%5."/>
+      <w:lvlJc w:val="left"/>
+      <w:pPr>
+        <w:ind w:left="3600" w:hanging="360"/>
+      </w:pPr>
+    </w:lvl>
+    <w:lvl w:ilvl="5" w:tplc="0409001B" w:tentative="1">
+      <w:start w:val="1"/>
+      <w:numFmt w:val="lowerRoman"/>
+      <w:lvlText w:val="%6."/>
+      <w:lvlJc w:val="right"/>
+      <w:pPr>
+        <w:ind w:left="4320" w:hanging="180"/>
+      </w:pPr>
+    </w:lvl>
+    <w:lvl w:ilvl="6" w:tplc="0409000F" w:tentative="1">
+      <w:start w:val="1"/>
+      <w:numFmt w:val="decimal"/>
+      <w:lvlText w:val="%7."/>
+      <w:lvlJc w:val="left"/>
+      <w:pPr>
+        <w:ind w:left="5040" w:hanging="360"/>
+      </w:pPr>
+    </w:lvl>
+    <w:lvl w:ilvl="7" w:tplc="04090019" w:tentative="1">
+      <w:start w:val="1"/>
+      <w:numFmt w:val="lowerLetter"/>
+      <w:lvlText w:val="%8."/>
+      <w:lvlJc w:val="left"/>
+      <w:pPr>
+        <w:ind w:left="5760" w:hanging="360"/>
+      </w:pPr>
+    </w:lvl>
+    <w:lvl w:ilvl="8" w:tplc="0409001B" w:tentative="1">
+      <w:start w:val="1"/>
+      <w:numFmt w:val="lowerRoman"/>
+      <w:lvlText w:val="%9."/>
+      <w:lvlJc w:val="right"/>
+      <w:pPr>
+        <w:ind w:left="6480" w:hanging="180"/>
+      </w:pPr>
+    </w:lvl>
+  </w:abstractNum>
+  <w:abstractNum w:abstractNumId="4" w15:restartNumberingAfterBreak="0">
     <w:nsid w:val="5DA00DF9"/>
     <w:multiLevelType w:val="multilevel"/>
     <w:tmpl w:val="419425DE"/>
@@ -2590,13 +5824,19 @@
     </w:lvl>
   </w:abstractNum>
   <w:num w:numId="1" w16cid:durableId="861749456">
-    <w:abstractNumId w:val="2"/>
+    <w:abstractNumId w:val="4"/>
   </w:num>
   <w:num w:numId="2" w16cid:durableId="1479230278">
     <w:abstractNumId w:val="0"/>
   </w:num>
   <w:num w:numId="3" w16cid:durableId="1097678155">
+    <w:abstractNumId w:val="2"/>
+  </w:num>
+  <w:num w:numId="4" w16cid:durableId="266737418">
     <w:abstractNumId w:val="1"/>
+  </w:num>
+  <w:num w:numId="5" w16cid:durableId="1982925752">
+    <w:abstractNumId w:val="3"/>
   </w:num>
 </w:numbering>
 </file>
@@ -3064,7 +6304,6 @@
     <w:name w:val="Normal (Web)"/>
     <w:basedOn w:val="Normal"/>
     <w:uiPriority w:val="99"/>
-    <w:semiHidden/>
     <w:unhideWhenUsed/>
     <w:rsid w:val="00CC6B5C"/>
     <w:pPr>
@@ -3123,6 +6362,16 @@
         <w:insideV w:val="single" w:sz="4" w:space="0" w:color="auto"/>
       </w:tblBorders>
     </w:tblPr>
+  </w:style>
+  <w:style w:type="character" w:styleId="PlaceholderText">
+    <w:name w:val="Placeholder Text"/>
+    <w:basedOn w:val="DefaultParagraphFont"/>
+    <w:uiPriority w:val="99"/>
+    <w:semiHidden/>
+    <w:rsid w:val="00D87E82"/>
+    <w:rPr>
+      <w:color w:val="666666"/>
+    </w:rPr>
   </w:style>
 </w:styles>
 </file>

</xml_diff>